<commit_message>
docs(wiki): rebuild ops-troubleshooting and user-common-problems docx
Co-Authored-By: Claude Opus 5.5 <noreply@anthropic.com>
Claude-Session: https://claude.ai/code/session_01KdRg4KoeiDi6Yth5vSXGEK
</commit_message>
<xml_diff>
--- a/docs/wiki/user-common-problems.docx
+++ b/docs/wiki/user-common-problems.docx
@@ -23,7 +23,7 @@
         <w:pStyle w:val="Date"/>
       </w:pPr>
       <w:r>
-        <w:t xml:space="preserve">Version of 2026-10-08</w:t>
+        <w:t xml:space="preserve">Version of 2026-10-28</w:t>
       </w:r>
     </w:p>
     <w:p>
@@ -229,7 +229,33 @@
         </w:r>
       </w:hyperlink>
     </w:p>
-    <w:bookmarkStart w:id="34" w:name="common-problems-and-how-to-solve-them"/>
+    <w:p>
+      <w:pPr>
+        <w:pStyle w:val="WikiTOC2"/>
+      </w:pPr>
+      <w:hyperlink w:anchor="Xe4e48c1d24d015d8ff81e3dc14da343e4cd9228">
+        <w:r>
+          <w:rPr>
+            <w:rStyle w:val="Hyperlink"/>
+          </w:rPr>
+          <w:t xml:space="preserve">14. read.csv() returns an old version of a file you just saved</w:t>
+        </w:r>
+      </w:hyperlink>
+    </w:p>
+    <w:p>
+      <w:pPr>
+        <w:pStyle w:val="WikiTOC2"/>
+      </w:pPr>
+      <w:hyperlink w:anchor="X76ce21d761047ba943b0580984bbe196f7a144a">
+        <w:r>
+          <w:rPr>
+            <w:rStyle w:val="Hyperlink"/>
+          </w:rPr>
+          <w:t xml:space="preserve">15. ranger / mlr3: "User interrupt or internal error"</w:t>
+        </w:r>
+      </w:hyperlink>
+    </w:p>
+    <w:bookmarkStart w:id="36" w:name="common-problems-and-how-to-solve-them"/>
     <w:p>
       <w:pPr>
         <w:pStyle w:val="Heading1"/>
@@ -244,8 +270,8 @@
       </w:pPr>
       <w:r>
         <w:rPr>
+          <w:bCs/>
           <w:b/>
-          <w:bCs/>
         </w:rPr>
         <w:t xml:space="preserve">For researchers using R on BIOME-CALC.</w:t>
       </w:r>
@@ -393,132 +419,144 @@
       </w:pPr>
       <w:r>
         <w:rPr>
+          <w:bCs/>
           <w:b/>
+        </w:rPr>
+        <w:t xml:space="preserve">What you see</w:t>
+      </w:r>
+    </w:p>
+    <w:p>
+      <w:pPr>
+        <w:pStyle w:val="SourceCode"/>
+      </w:pPr>
+      <w:r>
+        <w:rPr>
+          <w:rStyle w:val="VerbatimChar"/>
+        </w:rPr>
+        <w:t xml:space="preserve">Error in gzfile(file, mode) : cannot open the connection</w:t>
+      </w:r>
+      <w:r>
+        <w:br/>
+      </w:r>
+      <w:r>
+        <w:rPr>
+          <w:rStyle w:val="VerbatimChar"/>
+        </w:rPr>
+        <w:t xml:space="preserve">In addition: Warning message:</w:t>
+      </w:r>
+      <w:r>
+        <w:br/>
+      </w:r>
+      <w:r>
+        <w:rPr>
+          <w:rStyle w:val="VerbatimChar"/>
+        </w:rPr>
+        <w:t xml:space="preserve">In gzfile(file, mode) :</w:t>
+      </w:r>
+      <w:r>
+        <w:br/>
+      </w:r>
+      <w:r>
+        <w:rPr>
+          <w:rStyle w:val="VerbatimChar"/>
+        </w:rPr>
+        <w:t xml:space="preserve">  cannot open compressed file '/nfs/home/you/results.rds',</w:t>
+      </w:r>
+      <w:r>
+        <w:br/>
+      </w:r>
+      <w:r>
+        <w:rPr>
+          <w:rStyle w:val="VerbatimChar"/>
+        </w:rPr>
+        <w:t xml:space="preserve">  probable reason 'Disk quota exceeded'</w:t>
+      </w:r>
+    </w:p>
+    <w:p>
+      <w:pPr>
+        <w:pStyle w:val="FirstParagraph"/>
+      </w:pPr>
+      <w:r>
+        <w:t xml:space="preserve">The same happens with</w:t>
+      </w:r>
+      <w:r>
+        <w:t xml:space="preserve"> </w:t>
+      </w:r>
+      <w:r>
+        <w:rPr>
+          <w:rStyle w:val="VerbatimChar"/>
+        </w:rPr>
+        <w:t xml:space="preserve">write.csv()</w:t>
+      </w:r>
+      <w:r>
+        <w:t xml:space="preserve">,</w:t>
+      </w:r>
+      <w:r>
+        <w:t xml:space="preserve"> </w:t>
+      </w:r>
+      <w:r>
+        <w:rPr>
+          <w:rStyle w:val="VerbatimChar"/>
+        </w:rPr>
+        <w:t xml:space="preserve">writeLines()</w:t>
+      </w:r>
+      <w:r>
+        <w:t xml:space="preserve"> </w:t>
+      </w:r>
+      <w:r>
+        <w:t xml:space="preserve">and any other export.</w:t>
+      </w:r>
+      <w:r>
+        <w:t xml:space="preserve"> </w:t>
+      </w:r>
+      <w:r>
+        <w:t xml:space="preserve">The word "compressed" is misleading:</w:t>
+      </w:r>
+      <w:r>
+        <w:t xml:space="preserve"> </w:t>
+      </w:r>
+      <w:r>
+        <w:rPr>
+          <w:rStyle w:val="VerbatimChar"/>
+        </w:rPr>
+        <w:t xml:space="preserve">saveRDS()</w:t>
+      </w:r>
+      <w:r>
+        <w:t xml:space="preserve"> </w:t>
+      </w:r>
+      <w:r>
+        <w:t xml:space="preserve">always opens files that</w:t>
+      </w:r>
+      <w:r>
+        <w:t xml:space="preserve"> </w:t>
+      </w:r>
+      <w:r>
+        <w:t xml:space="preserve">way. The real message is</w:t>
+      </w:r>
+      <w:r>
+        <w:t xml:space="preserve"> </w:t>
+      </w:r>
+      <w:r>
+        <w:rPr>
           <w:bCs/>
-        </w:rPr>
-        <w:t xml:space="preserve">What you see</w:t>
-      </w:r>
-    </w:p>
-    <w:p>
-      <w:pPr>
-        <w:pStyle w:val="SourceCode"/>
-      </w:pPr>
-      <w:r>
-        <w:rPr>
-          <w:rStyle w:val="VerbatimChar"/>
-        </w:rPr>
-        <w:t xml:space="preserve">Error in gzfile(file, mode) : cannot open the connection</w:t>
-      </w:r>
-      <w:r>
-        <w:br/>
-      </w:r>
-      <w:r>
-        <w:rPr>
-          <w:rStyle w:val="VerbatimChar"/>
-        </w:rPr>
-        <w:t xml:space="preserve">In addition: Warning message:</w:t>
-      </w:r>
-      <w:r>
-        <w:br/>
-      </w:r>
-      <w:r>
-        <w:rPr>
-          <w:rStyle w:val="VerbatimChar"/>
-        </w:rPr>
-        <w:t xml:space="preserve">In gzfile(file, mode) :</w:t>
-      </w:r>
-      <w:r>
-        <w:br/>
-      </w:r>
-      <w:r>
-        <w:rPr>
-          <w:rStyle w:val="VerbatimChar"/>
-        </w:rPr>
-        <w:t xml:space="preserve">  cannot open compressed file '/nfs/home/you/results.rds',</w:t>
-      </w:r>
-      <w:r>
-        <w:br/>
-      </w:r>
-      <w:r>
-        <w:rPr>
-          <w:rStyle w:val="VerbatimChar"/>
-        </w:rPr>
-        <w:t xml:space="preserve">  probable reason 'Disk quota exceeded'</w:t>
-      </w:r>
-    </w:p>
-    <w:p>
-      <w:pPr>
-        <w:pStyle w:val="FirstParagraph"/>
-      </w:pPr>
-      <w:r>
-        <w:t xml:space="preserve">The same happens with</w:t>
-      </w:r>
-      <w:r>
-        <w:t xml:space="preserve"> </w:t>
-      </w:r>
-      <w:r>
-        <w:rPr>
-          <w:rStyle w:val="VerbatimChar"/>
-        </w:rPr>
-        <w:t xml:space="preserve">write.csv()</w:t>
-      </w:r>
-      <w:r>
-        <w:t xml:space="preserve">,</w:t>
-      </w:r>
-      <w:r>
-        <w:t xml:space="preserve"> </w:t>
-      </w:r>
-      <w:r>
-        <w:rPr>
-          <w:rStyle w:val="VerbatimChar"/>
-        </w:rPr>
-        <w:t xml:space="preserve">writeLines()</w:t>
-      </w:r>
-      <w:r>
-        <w:t xml:space="preserve"> </w:t>
-      </w:r>
-      <w:r>
-        <w:t xml:space="preserve">and any other export.</w:t>
-      </w:r>
-      <w:r>
-        <w:t xml:space="preserve"> </w:t>
-      </w:r>
-      <w:r>
-        <w:t xml:space="preserve">The word "compressed" is misleading:</w:t>
-      </w:r>
-      <w:r>
-        <w:t xml:space="preserve"> </w:t>
-      </w:r>
-      <w:r>
-        <w:rPr>
-          <w:rStyle w:val="VerbatimChar"/>
-        </w:rPr>
-        <w:t xml:space="preserve">saveRDS()</w:t>
-      </w:r>
-      <w:r>
-        <w:t xml:space="preserve"> </w:t>
-      </w:r>
-      <w:r>
-        <w:t xml:space="preserve">always opens files that</w:t>
-      </w:r>
-      <w:r>
-        <w:t xml:space="preserve"> </w:t>
-      </w:r>
-      <w:r>
-        <w:t xml:space="preserve">way. The real message is</w:t>
-      </w:r>
-      <w:r>
-        <w:t xml:space="preserve"> </w:t>
-      </w:r>
-      <w:r>
-        <w:rPr>
           <w:b/>
+        </w:rPr>
+        <w:t xml:space="preserve">Disk quota exceeded</w:t>
+      </w:r>
+      <w:r>
+        <w:t xml:space="preserve">.</w:t>
+      </w:r>
+    </w:p>
+    <w:p>
+      <w:pPr>
+        <w:pStyle w:val="BodyText"/>
+      </w:pPr>
+      <w:r>
+        <w:rPr>
           <w:bCs/>
-        </w:rPr>
-        <w:t xml:space="preserve">Disk quota exceeded</w:t>
-      </w:r>
-      <w:r>
-        <w:t xml:space="preserve">.</w:t>
+          <w:b/>
+        </w:rPr>
+        <w:t xml:space="preserve">Why it happens</w:t>
       </w:r>
     </w:p>
     <w:p>
@@ -526,59 +564,47 @@
         <w:pStyle w:val="BodyText"/>
       </w:pPr>
       <w:r>
-        <w:rPr>
+        <w:t xml:space="preserve">Your home folder has a personal size limit (quota). When it is full, no new</w:t>
+      </w:r>
+      <w:r>
+        <w:t xml:space="preserve"> </w:t>
+      </w:r>
+      <w:r>
+        <w:t xml:space="preserve">file can be created, not even a tiny one. Tools that show free disk space</w:t>
+      </w:r>
+      <w:r>
+        <w:t xml:space="preserve"> </w:t>
+      </w:r>
+      <w:r>
+        <w:t xml:space="preserve">(the Files pane,</w:t>
+      </w:r>
+      <w:r>
+        <w:t xml:space="preserve"> </w:t>
+      </w:r>
+      <w:r>
+        <w:rPr>
+          <w:rStyle w:val="VerbatimChar"/>
+        </w:rPr>
+        <w:t xml:space="preserve">df</w:t>
+      </w:r>
+      <w:r>
+        <w:t xml:space="preserve">) show the space of the whole storage, not your</w:t>
+      </w:r>
+      <w:r>
+        <w:t xml:space="preserve"> </w:t>
+      </w:r>
+      <w:r>
+        <w:t xml:space="preserve">personal limit, so they can say "plenty of space" while your quota is full.</w:t>
+      </w:r>
+    </w:p>
+    <w:p>
+      <w:pPr>
+        <w:pStyle w:val="BodyText"/>
+      </w:pPr>
+      <w:r>
+        <w:rPr>
+          <w:bCs/>
           <w:b/>
-          <w:bCs/>
-        </w:rPr>
-        <w:t xml:space="preserve">Why it happens</w:t>
-      </w:r>
-    </w:p>
-    <w:p>
-      <w:pPr>
-        <w:pStyle w:val="BodyText"/>
-      </w:pPr>
-      <w:r>
-        <w:t xml:space="preserve">Your home folder has a personal size limit (quota). When it is full, no new</w:t>
-      </w:r>
-      <w:r>
-        <w:t xml:space="preserve"> </w:t>
-      </w:r>
-      <w:r>
-        <w:t xml:space="preserve">file can be created, not even a tiny one. Tools that show free disk space</w:t>
-      </w:r>
-      <w:r>
-        <w:t xml:space="preserve"> </w:t>
-      </w:r>
-      <w:r>
-        <w:t xml:space="preserve">(the Files pane,</w:t>
-      </w:r>
-      <w:r>
-        <w:t xml:space="preserve"> </w:t>
-      </w:r>
-      <w:r>
-        <w:rPr>
-          <w:rStyle w:val="VerbatimChar"/>
-        </w:rPr>
-        <w:t xml:space="preserve">df</w:t>
-      </w:r>
-      <w:r>
-        <w:t xml:space="preserve">) show the space of the whole storage, not your</w:t>
-      </w:r>
-      <w:r>
-        <w:t xml:space="preserve"> </w:t>
-      </w:r>
-      <w:r>
-        <w:t xml:space="preserve">personal limit, so they can say "plenty of space" while your quota is full.</w:t>
-      </w:r>
-    </w:p>
-    <w:p>
-      <w:pPr>
-        <w:pStyle w:val="BodyText"/>
-      </w:pPr>
-      <w:r>
-        <w:rPr>
-          <w:b/>
-          <w:bCs/>
         </w:rPr>
         <w:t xml:space="preserve">What you can do</w:t>
       </w:r>
@@ -700,11 +726,11 @@
     </w:p>
     <w:p>
       <w:pPr>
-        <w:pStyle w:val="SourceCode"/>
         <w:numPr>
           <w:ilvl w:val="0"/>
           <w:numId w:val="1000"/>
         </w:numPr>
+        <w:pStyle w:val="SourceCode"/>
       </w:pPr>
       <w:r>
         <w:rPr>
@@ -1091,11 +1117,11 @@
     </w:p>
     <w:p>
       <w:pPr>
-        <w:pStyle w:val="SourceCode"/>
         <w:numPr>
           <w:ilvl w:val="0"/>
           <w:numId w:val="1000"/>
         </w:numPr>
+        <w:pStyle w:val="SourceCode"/>
       </w:pPr>
       <w:r>
         <w:rPr>
@@ -1210,8 +1236,8 @@
       </w:pPr>
       <w:r>
         <w:rPr>
+          <w:bCs/>
           <w:b/>
-          <w:bCs/>
         </w:rPr>
         <w:t xml:space="preserve">When to ask the admins</w:t>
       </w:r>
@@ -1268,131 +1294,131 @@
       </w:pPr>
       <w:r>
         <w:rPr>
+          <w:bCs/>
           <w:b/>
+        </w:rPr>
+        <w:t xml:space="preserve">What you see</w:t>
+      </w:r>
+    </w:p>
+    <w:p>
+      <w:pPr>
+        <w:pStyle w:val="SourceCode"/>
+      </w:pPr>
+      <w:r>
+        <w:rPr>
+          <w:rStyle w:val="VerbatimChar"/>
+        </w:rPr>
+        <w:t xml:space="preserve">Error in file(con, "wb") : cannot open the connection</w:t>
+      </w:r>
+      <w:r>
+        <w:br/>
+      </w:r>
+      <w:r>
+        <w:rPr>
+          <w:rStyle w:val="VerbatimChar"/>
+        </w:rPr>
+        <w:t xml:space="preserve">In addition: Warning message:</w:t>
+      </w:r>
+      <w:r>
+        <w:br/>
+      </w:r>
+      <w:r>
+        <w:rPr>
+          <w:rStyle w:val="VerbatimChar"/>
+        </w:rPr>
+        <w:t xml:space="preserve">In file(con, "wb") :</w:t>
+      </w:r>
+      <w:r>
+        <w:br/>
+      </w:r>
+      <w:r>
+        <w:rPr>
+          <w:rStyle w:val="VerbatimChar"/>
+        </w:rPr>
+        <w:t xml:space="preserve">  cannot open file '/mnt/ProjectStorage/myproject/out.csv': Permission denied</w:t>
+      </w:r>
+    </w:p>
+    <w:p>
+      <w:pPr>
+        <w:pStyle w:val="FirstParagraph"/>
+      </w:pPr>
+      <w:r>
+        <w:rPr>
           <w:bCs/>
-        </w:rPr>
-        <w:t xml:space="preserve">What you see</w:t>
-      </w:r>
-    </w:p>
-    <w:p>
-      <w:pPr>
-        <w:pStyle w:val="SourceCode"/>
-      </w:pPr>
-      <w:r>
-        <w:rPr>
-          <w:rStyle w:val="VerbatimChar"/>
-        </w:rPr>
-        <w:t xml:space="preserve">Error in file(con, "wb") : cannot open the connection</w:t>
-      </w:r>
-      <w:r>
-        <w:br/>
-      </w:r>
-      <w:r>
-        <w:rPr>
-          <w:rStyle w:val="VerbatimChar"/>
-        </w:rPr>
-        <w:t xml:space="preserve">In addition: Warning message:</w:t>
-      </w:r>
-      <w:r>
-        <w:br/>
-      </w:r>
-      <w:r>
-        <w:rPr>
-          <w:rStyle w:val="VerbatimChar"/>
-        </w:rPr>
-        <w:t xml:space="preserve">In file(con, "wb") :</w:t>
-      </w:r>
-      <w:r>
-        <w:br/>
-      </w:r>
-      <w:r>
-        <w:rPr>
-          <w:rStyle w:val="VerbatimChar"/>
-        </w:rPr>
-        <w:t xml:space="preserve">  cannot open file '/mnt/ProjectStorage/myproject/out.csv': Permission denied</w:t>
-      </w:r>
-    </w:p>
-    <w:p>
-      <w:pPr>
-        <w:pStyle w:val="FirstParagraph"/>
-      </w:pPr>
-      <w:r>
-        <w:rPr>
           <w:b/>
+        </w:rPr>
+        <w:t xml:space="preserve">Why it happens</w:t>
+      </w:r>
+    </w:p>
+    <w:p>
+      <w:pPr>
+        <w:pStyle w:val="BodyText"/>
+      </w:pPr>
+      <w:r>
+        <w:rPr>
+          <w:rStyle w:val="VerbatimChar"/>
+        </w:rPr>
+        <w:t xml:space="preserve">/mnt/ProjectStorage</w:t>
+      </w:r>
+      <w:r>
+        <w:t xml:space="preserve"> </w:t>
+      </w:r>
+      <w:r>
+        <w:t xml:space="preserve">is the shared project archive. Being able to</w:t>
+      </w:r>
+      <w:r>
+        <w:t xml:space="preserve"> </w:t>
+      </w:r>
+      <w:r>
+        <w:rPr>
+          <w:iCs/>
+          <w:i/>
+        </w:rPr>
+        <w:t xml:space="preserve">see</w:t>
+      </w:r>
+      <w:r>
+        <w:t xml:space="preserve"> </w:t>
+      </w:r>
+      <w:r>
+        <w:t xml:space="preserve">a</w:t>
+      </w:r>
+      <w:r>
+        <w:t xml:space="preserve"> </w:t>
+      </w:r>
+      <w:r>
+        <w:t xml:space="preserve">folder there does not mean you can</w:t>
+      </w:r>
+      <w:r>
+        <w:t xml:space="preserve"> </w:t>
+      </w:r>
+      <w:r>
+        <w:rPr>
+          <w:iCs/>
+          <w:i/>
+        </w:rPr>
+        <w:t xml:space="preserve">write</w:t>
+      </w:r>
+      <w:r>
+        <w:t xml:space="preserve"> </w:t>
+      </w:r>
+      <w:r>
+        <w:t xml:space="preserve">to it: write access is given per</w:t>
+      </w:r>
+      <w:r>
+        <w:t xml:space="preserve"> </w:t>
+      </w:r>
+      <w:r>
+        <w:t xml:space="preserve">project.</w:t>
+      </w:r>
+    </w:p>
+    <w:p>
+      <w:pPr>
+        <w:pStyle w:val="BodyText"/>
+      </w:pPr>
+      <w:r>
+        <w:rPr>
           <w:bCs/>
-        </w:rPr>
-        <w:t xml:space="preserve">Why it happens</w:t>
-      </w:r>
-    </w:p>
-    <w:p>
-      <w:pPr>
-        <w:pStyle w:val="BodyText"/>
-      </w:pPr>
-      <w:r>
-        <w:rPr>
-          <w:rStyle w:val="VerbatimChar"/>
-        </w:rPr>
-        <w:t xml:space="preserve">/mnt/ProjectStorage</w:t>
-      </w:r>
-      <w:r>
-        <w:t xml:space="preserve"> </w:t>
-      </w:r>
-      <w:r>
-        <w:t xml:space="preserve">is the shared project archive. Being able to</w:t>
-      </w:r>
-      <w:r>
-        <w:t xml:space="preserve"> </w:t>
-      </w:r>
-      <w:r>
-        <w:rPr>
-          <w:i/>
-          <w:iCs/>
-        </w:rPr>
-        <w:t xml:space="preserve">see</w:t>
-      </w:r>
-      <w:r>
-        <w:t xml:space="preserve"> </w:t>
-      </w:r>
-      <w:r>
-        <w:t xml:space="preserve">a</w:t>
-      </w:r>
-      <w:r>
-        <w:t xml:space="preserve"> </w:t>
-      </w:r>
-      <w:r>
-        <w:t xml:space="preserve">folder there does not mean you can</w:t>
-      </w:r>
-      <w:r>
-        <w:t xml:space="preserve"> </w:t>
-      </w:r>
-      <w:r>
-        <w:rPr>
-          <w:i/>
-          <w:iCs/>
-        </w:rPr>
-        <w:t xml:space="preserve">write</w:t>
-      </w:r>
-      <w:r>
-        <w:t xml:space="preserve"> </w:t>
-      </w:r>
-      <w:r>
-        <w:t xml:space="preserve">to it: write access is given per</w:t>
-      </w:r>
-      <w:r>
-        <w:t xml:space="preserve"> </w:t>
-      </w:r>
-      <w:r>
-        <w:t xml:space="preserve">project.</w:t>
-      </w:r>
-    </w:p>
-    <w:p>
-      <w:pPr>
-        <w:pStyle w:val="BodyText"/>
-      </w:pPr>
-      <w:r>
-        <w:rPr>
           <w:b/>
-          <w:bCs/>
         </w:rPr>
         <w:t xml:space="preserve">What you can do</w:t>
       </w:r>
@@ -1410,11 +1436,11 @@
     </w:p>
     <w:p>
       <w:pPr>
-        <w:pStyle w:val="SourceCode"/>
         <w:numPr>
           <w:ilvl w:val="0"/>
           <w:numId w:val="1000"/>
         </w:numPr>
+        <w:pStyle w:val="SourceCode"/>
       </w:pPr>
       <w:r>
         <w:rPr>
@@ -1494,8 +1520,8 @@
       </w:pPr>
       <w:r>
         <w:rPr>
+          <w:bCs/>
           <w:b/>
-          <w:bCs/>
         </w:rPr>
         <w:t xml:space="preserve">When to ask the admins</w:t>
       </w:r>
@@ -1537,10 +1563,179 @@
       </w:pPr>
       <w:r>
         <w:rPr>
+          <w:bCs/>
           <w:b/>
+        </w:rPr>
+        <w:t xml:space="preserve">What you see</w:t>
+      </w:r>
+    </w:p>
+    <w:p>
+      <w:pPr>
+        <w:pStyle w:val="BodyText"/>
+      </w:pPr>
+      <w:r>
+        <w:t xml:space="preserve">A plain R error:</w:t>
+      </w:r>
+    </w:p>
+    <w:p>
+      <w:pPr>
+        <w:pStyle w:val="SourceCode"/>
+      </w:pPr>
+      <w:r>
+        <w:rPr>
+          <w:rStyle w:val="VerbatimChar"/>
+        </w:rPr>
+        <w:t xml:space="preserve">Error: cannot allocate vector of size 74.5 Gb</w:t>
+      </w:r>
+    </w:p>
+    <w:p>
+      <w:pPr>
+        <w:pStyle w:val="FirstParagraph"/>
+      </w:pPr>
+      <w:r>
+        <w:t xml:space="preserve">or a BIOME-CALC warning</w:t>
+      </w:r>
+      <w:r>
+        <w:t xml:space="preserve"> </w:t>
+      </w:r>
+      <w:r>
+        <w:rPr>
+          <w:iCs/>
+          <w:i/>
+        </w:rPr>
+        <w:t xml:space="preserve">before</w:t>
+      </w:r>
+      <w:r>
+        <w:t xml:space="preserve"> </w:t>
+      </w:r>
+      <w:r>
+        <w:t xml:space="preserve">the calculation starts, for example:</w:t>
+      </w:r>
+    </w:p>
+    <w:p>
+      <w:pPr>
+        <w:pStyle w:val="SourceCode"/>
+      </w:pPr>
+      <w:r>
+        <w:rPr>
+          <w:rStyle w:val="VerbatimChar"/>
+        </w:rPr>
+        <w:t xml:space="preserve">BIOME-CALC: solve() on 50000 x 50000 matrix (~19 GB) needs ~38 GB.</w:t>
+      </w:r>
+      <w:r>
+        <w:br/>
+      </w:r>
+      <w:r>
+        <w:rPr>
+          <w:rStyle w:val="VerbatimChar"/>
+        </w:rPr>
+        <w:t xml:space="preserve">  Available RAM: ~24 GB. OOM risk is HIGH.</w:t>
+      </w:r>
+      <w:r>
+        <w:br/>
+      </w:r>
+      <w:r>
+        <w:rPr>
+          <w:rStyle w:val="VerbatimChar"/>
+        </w:rPr>
+        <w:t xml:space="preserve">  BLAS: serial (no thread reduction available).</w:t>
+      </w:r>
+      <w:r>
+        <w:br/>
+      </w:r>
+      <w:r>
+        <w:rPr>
+          <w:rStyle w:val="VerbatimChar"/>
+        </w:rPr>
+        <w:t xml:space="preserve">  Alternatives: Matrix::Cholesky() for SPD, or sparse methods.</w:t>
+      </w:r>
+    </w:p>
+    <w:p>
+      <w:pPr>
+        <w:pStyle w:val="FirstParagraph"/>
+      </w:pPr>
+      <w:r>
+        <w:t xml:space="preserve">Similar warnings exist for</w:t>
+      </w:r>
+      <w:r>
+        <w:t xml:space="preserve"> </w:t>
+      </w:r>
+      <w:r>
+        <w:rPr>
+          <w:rStyle w:val="VerbatimChar"/>
+        </w:rPr>
+        <w:t xml:space="preserve">dist()</w:t>
+      </w:r>
+      <w:r>
+        <w:t xml:space="preserve">,</w:t>
+      </w:r>
+      <w:r>
+        <w:t xml:space="preserve"> </w:t>
+      </w:r>
+      <w:r>
+        <w:rPr>
+          <w:rStyle w:val="VerbatimChar"/>
+        </w:rPr>
+        <w:t xml:space="preserve">outer()</w:t>
+      </w:r>
+      <w:r>
+        <w:t xml:space="preserve"> </w:t>
+      </w:r>
+      <w:r>
+        <w:t xml:space="preserve">and</w:t>
+      </w:r>
+      <w:r>
+        <w:t xml:space="preserve"> </w:t>
+      </w:r>
+      <w:r>
+        <w:rPr>
+          <w:rStyle w:val="VerbatimChar"/>
+        </w:rPr>
+        <w:t xml:space="preserve">expand.grid()</w:t>
+      </w:r>
+      <w:r>
+        <w:t xml:space="preserve">:</w:t>
+      </w:r>
+    </w:p>
+    <w:p>
+      <w:pPr>
+        <w:pStyle w:val="SourceCode"/>
+      </w:pPr>
+      <w:r>
+        <w:rPr>
+          <w:rStyle w:val="VerbatimChar"/>
+        </w:rPr>
+        <w:t xml:space="preserve">BIOME-CALC: dist() on 100000 observations will create a 37.3 GB dist object.</w:t>
+      </w:r>
+      <w:r>
+        <w:br/>
+      </w:r>
+      <w:r>
+        <w:rPr>
+          <w:rStyle w:val="VerbatimChar"/>
+        </w:rPr>
+        <w:t xml:space="preserve">  as.matrix() on this would need 74.5 GB. Available RAM: ~24 GB.</w:t>
+      </w:r>
+      <w:r>
+        <w:br/>
+      </w:r>
+      <w:r>
+        <w:rPr>
+          <w:rStyle w:val="VerbatimChar"/>
+        </w:rPr>
+        <w:t xml:space="preserve">  For N &gt; 20,000: consider sparse distance methods or spatial indexing.</w:t>
+      </w:r>
+    </w:p>
+    <w:p>
+      <w:pPr>
+        <w:pStyle w:val="FirstParagraph"/>
+      </w:pPr>
+      <w:r>
+        <w:rPr>
           <w:bCs/>
-        </w:rPr>
-        <w:t xml:space="preserve">What you see</w:t>
+          <w:b/>
+        </w:rPr>
+        <w:t xml:space="preserve">Why it happens</w:t>
       </w:r>
     </w:p>
     <w:p>
@@ -1548,215 +1743,46 @@
         <w:pStyle w:val="BodyText"/>
       </w:pPr>
       <w:r>
-        <w:t xml:space="preserve">A plain R error:</w:t>
-      </w:r>
-    </w:p>
-    <w:p>
-      <w:pPr>
-        <w:pStyle w:val="SourceCode"/>
-      </w:pPr>
-      <w:r>
-        <w:rPr>
-          <w:rStyle w:val="VerbatimChar"/>
-        </w:rPr>
-        <w:t xml:space="preserve">Error: cannot allocate vector of size 74.5 Gb</w:t>
-      </w:r>
-    </w:p>
-    <w:p>
-      <w:pPr>
-        <w:pStyle w:val="FirstParagraph"/>
-      </w:pPr>
-      <w:r>
-        <w:t xml:space="preserve">or a BIOME-CALC warning</w:t>
-      </w:r>
-      <w:r>
-        <w:t xml:space="preserve"> </w:t>
-      </w:r>
-      <w:r>
-        <w:rPr>
-          <w:i/>
-          <w:iCs/>
-        </w:rPr>
-        <w:t xml:space="preserve">before</w:t>
-      </w:r>
-      <w:r>
-        <w:t xml:space="preserve"> </w:t>
-      </w:r>
-      <w:r>
-        <w:t xml:space="preserve">the calculation starts, for example:</w:t>
-      </w:r>
-    </w:p>
-    <w:p>
-      <w:pPr>
-        <w:pStyle w:val="SourceCode"/>
-      </w:pPr>
-      <w:r>
-        <w:rPr>
-          <w:rStyle w:val="VerbatimChar"/>
-        </w:rPr>
-        <w:t xml:space="preserve">BIOME-CALC: solve() on 50000 x 50000 matrix (~19 GB) needs ~38 GB.</w:t>
-      </w:r>
-      <w:r>
-        <w:br/>
-      </w:r>
-      <w:r>
-        <w:rPr>
-          <w:rStyle w:val="VerbatimChar"/>
-        </w:rPr>
-        <w:t xml:space="preserve">  Available RAM: ~24 GB. OOM risk is HIGH.</w:t>
-      </w:r>
-      <w:r>
-        <w:br/>
-      </w:r>
-      <w:r>
-        <w:rPr>
-          <w:rStyle w:val="VerbatimChar"/>
-        </w:rPr>
-        <w:t xml:space="preserve">  BLAS: serial (no thread reduction available).</w:t>
-      </w:r>
-      <w:r>
-        <w:br/>
-      </w:r>
-      <w:r>
-        <w:rPr>
-          <w:rStyle w:val="VerbatimChar"/>
-        </w:rPr>
-        <w:t xml:space="preserve">  Alternatives: Matrix::Cholesky() for SPD, or sparse methods.</w:t>
-      </w:r>
-    </w:p>
-    <w:p>
-      <w:pPr>
-        <w:pStyle w:val="FirstParagraph"/>
-      </w:pPr>
-      <w:r>
-        <w:t xml:space="preserve">Similar warnings exist for</w:t>
-      </w:r>
-      <w:r>
-        <w:t xml:space="preserve"> </w:t>
-      </w:r>
-      <w:r>
-        <w:rPr>
-          <w:rStyle w:val="VerbatimChar"/>
-        </w:rPr>
-        <w:t xml:space="preserve">dist()</w:t>
-      </w:r>
-      <w:r>
-        <w:t xml:space="preserve">,</w:t>
-      </w:r>
-      <w:r>
-        <w:t xml:space="preserve"> </w:t>
-      </w:r>
-      <w:r>
-        <w:rPr>
-          <w:rStyle w:val="VerbatimChar"/>
-        </w:rPr>
-        <w:t xml:space="preserve">outer()</w:t>
-      </w:r>
-      <w:r>
-        <w:t xml:space="preserve"> </w:t>
-      </w:r>
-      <w:r>
-        <w:t xml:space="preserve">and</w:t>
-      </w:r>
-      <w:r>
-        <w:t xml:space="preserve"> </w:t>
-      </w:r>
-      <w:r>
-        <w:rPr>
-          <w:rStyle w:val="VerbatimChar"/>
-        </w:rPr>
-        <w:t xml:space="preserve">expand.grid()</w:t>
-      </w:r>
-      <w:r>
-        <w:t xml:space="preserve">:</w:t>
-      </w:r>
-    </w:p>
-    <w:p>
-      <w:pPr>
-        <w:pStyle w:val="SourceCode"/>
-      </w:pPr>
-      <w:r>
-        <w:rPr>
-          <w:rStyle w:val="VerbatimChar"/>
-        </w:rPr>
-        <w:t xml:space="preserve">BIOME-CALC: dist() on 100000 observations will create a 37.3 GB dist object.</w:t>
-      </w:r>
-      <w:r>
-        <w:br/>
-      </w:r>
-      <w:r>
-        <w:rPr>
-          <w:rStyle w:val="VerbatimChar"/>
-        </w:rPr>
-        <w:t xml:space="preserve">  as.matrix() on this would need 74.5 GB. Available RAM: ~24 GB.</w:t>
-      </w:r>
-      <w:r>
-        <w:br/>
-      </w:r>
-      <w:r>
-        <w:rPr>
-          <w:rStyle w:val="VerbatimChar"/>
-        </w:rPr>
-        <w:t xml:space="preserve">  For N &gt; 20,000: consider sparse distance methods or spatial indexing.</w:t>
-      </w:r>
-    </w:p>
-    <w:p>
-      <w:pPr>
-        <w:pStyle w:val="FirstParagraph"/>
-      </w:pPr>
-      <w:r>
-        <w:rPr>
+        <w:t xml:space="preserve">The server is shared, and each user gets a share of its memory. The</w:t>
+      </w:r>
+      <w:r>
+        <w:t xml:space="preserve"> </w:t>
+      </w:r>
+      <w:r>
+        <w:t xml:space="preserve">warning estimates how much memory the calculation needs and tells you</w:t>
+      </w:r>
+      <w:r>
+        <w:t xml:space="preserve"> </w:t>
+      </w:r>
+      <w:r>
+        <w:t xml:space="preserve">before R runs out. If you go ahead anyway and the memory really runs out,</w:t>
+      </w:r>
+      <w:r>
+        <w:t xml:space="preserve"> </w:t>
+      </w:r>
+      <w:r>
+        <w:t xml:space="preserve">the R session is stopped (see section 4).</w:t>
+      </w:r>
+    </w:p>
+    <w:p>
+      <w:pPr>
+        <w:pStyle w:val="BodyText"/>
+      </w:pPr>
+      <w:r>
+        <w:rPr>
+          <w:bCs/>
           <w:b/>
-          <w:bCs/>
-        </w:rPr>
-        <w:t xml:space="preserve">Why it happens</w:t>
-      </w:r>
-    </w:p>
-    <w:p>
-      <w:pPr>
-        <w:pStyle w:val="BodyText"/>
-      </w:pPr>
-      <w:r>
-        <w:t xml:space="preserve">The server is shared, and each user gets a share of its memory. The</w:t>
-      </w:r>
-      <w:r>
-        <w:t xml:space="preserve"> </w:t>
-      </w:r>
-      <w:r>
-        <w:t xml:space="preserve">warning estimates how much memory the calculation needs and tells you</w:t>
-      </w:r>
-      <w:r>
-        <w:t xml:space="preserve"> </w:t>
-      </w:r>
-      <w:r>
-        <w:t xml:space="preserve">before R runs out. If you go ahead anyway and the memory really runs out,</w:t>
-      </w:r>
-      <w:r>
-        <w:t xml:space="preserve"> </w:t>
-      </w:r>
-      <w:r>
-        <w:t xml:space="preserve">the R session is stopped (see section 4).</w:t>
-      </w:r>
-    </w:p>
-    <w:p>
-      <w:pPr>
-        <w:pStyle w:val="BodyText"/>
-      </w:pPr>
-      <w:r>
-        <w:rPr>
-          <w:b/>
-          <w:bCs/>
         </w:rPr>
         <w:t xml:space="preserve">What you can do</w:t>
       </w:r>
     </w:p>
     <w:p>
       <w:pPr>
-        <w:pStyle w:val="Compact"/>
         <w:numPr>
           <w:ilvl w:val="0"/>
           <w:numId w:val="1003"/>
         </w:numPr>
+        <w:pStyle w:val="Compact"/>
       </w:pPr>
       <w:r>
         <w:t xml:space="preserve">See your memory:</w:t>
@@ -1779,11 +1805,11 @@
     </w:p>
     <w:p>
       <w:pPr>
-        <w:pStyle w:val="Compact"/>
         <w:numPr>
           <w:ilvl w:val="0"/>
           <w:numId w:val="1003"/>
         </w:numPr>
+        <w:pStyle w:val="Compact"/>
       </w:pPr>
       <w:r>
         <w:t xml:space="preserve">Follow the alternatives printed in the warning. For large distance</w:t>
@@ -1799,22 +1825,22 @@
       </w:r>
       <w:r>
         <w:rPr>
+          <w:iCs/>
           <w:i/>
+        </w:rPr>
+        <w:t xml:space="preserve">Working with Large Spatial Correlation</w:t>
+      </w:r>
+      <w:r>
+        <w:rPr>
           <w:iCs/>
-        </w:rPr>
-        <w:t xml:space="preserve">Working with Large Spatial Correlation</w:t>
-      </w:r>
-      <w:r>
-        <w:rPr>
           <w:i/>
+        </w:rPr>
+        <w:t xml:space="preserve"> </w:t>
+      </w:r>
+      <w:r>
+        <w:rPr>
           <w:iCs/>
-        </w:rPr>
-        <w:t xml:space="preserve"> </w:t>
-      </w:r>
-      <w:r>
-        <w:rPr>
           <w:i/>
-          <w:iCs/>
         </w:rPr>
         <w:t xml:space="preserve">Matrices</w:t>
       </w:r>
@@ -1866,11 +1892,11 @@
     </w:p>
     <w:p>
       <w:pPr>
-        <w:pStyle w:val="Compact"/>
         <w:numPr>
           <w:ilvl w:val="0"/>
           <w:numId w:val="1003"/>
         </w:numPr>
+        <w:pStyle w:val="Compact"/>
       </w:pPr>
       <w:r>
         <w:t xml:space="preserve">Remove big objects you no longer need:</w:t>
@@ -1890,11 +1916,11 @@
     </w:p>
     <w:p>
       <w:pPr>
-        <w:pStyle w:val="Compact"/>
         <w:numPr>
           <w:ilvl w:val="0"/>
           <w:numId w:val="1003"/>
         </w:numPr>
+        <w:pStyle w:val="Compact"/>
       </w:pPr>
       <w:r>
         <w:t xml:space="preserve">Work in chunks and save each chunk with</w:t>
@@ -1921,8 +1947,8 @@
       </w:pPr>
       <w:r>
         <w:rPr>
+          <w:bCs/>
           <w:b/>
-          <w:bCs/>
         </w:rPr>
         <w:t xml:space="preserve">When to ask the admins</w:t>
       </w:r>
@@ -1979,10 +2005,65 @@
       </w:pPr>
       <w:r>
         <w:rPr>
+          <w:bCs/>
           <w:b/>
+        </w:rPr>
+        <w:t xml:space="preserve">What you see</w:t>
+      </w:r>
+    </w:p>
+    <w:p>
+      <w:pPr>
+        <w:pStyle w:val="BodyText"/>
+      </w:pPr>
+      <w:r>
+        <w:t xml:space="preserve">RStudio shows</w:t>
+      </w:r>
+      <w:r>
+        <w:t xml:space="preserve"> </w:t>
+      </w:r>
+      <w:r>
+        <w:rPr>
           <w:bCs/>
-        </w:rPr>
-        <w:t xml:space="preserve">What you see</w:t>
+          <w:b/>
+        </w:rPr>
+        <w:t xml:space="preserve">"R session aborted"</w:t>
+      </w:r>
+      <w:r>
+        <w:t xml:space="preserve"> </w:t>
+      </w:r>
+      <w:r>
+        <w:t xml:space="preserve">and restarts with an empty</w:t>
+      </w:r>
+      <w:r>
+        <w:t xml:space="preserve"> </w:t>
+      </w:r>
+      <w:r>
+        <w:t xml:space="preserve">environment. Your next session may start with:</w:t>
+      </w:r>
+    </w:p>
+    <w:p>
+      <w:pPr>
+        <w:pStyle w:val="SourceCode"/>
+      </w:pPr>
+      <w:r>
+        <w:rPr>
+          <w:rStyle w:val="VerbatimChar"/>
+        </w:rPr>
+        <w:t xml:space="preserve">WARNING: Previous session killed by OOM</w:t>
+      </w:r>
+    </w:p>
+    <w:p>
+      <w:pPr>
+        <w:pStyle w:val="FirstParagraph"/>
+      </w:pPr>
+      <w:r>
+        <w:t xml:space="preserve">Sometimes the browser tab crashes instead ("Aw, Snap!"), usually when</w:t>
+      </w:r>
+      <w:r>
+        <w:t xml:space="preserve"> </w:t>
+      </w:r>
+      <w:r>
+        <w:t xml:space="preserve">RStudio reloads a very large workspace.</w:t>
       </w:r>
     </w:p>
     <w:p>
@@ -1990,128 +2071,73 @@
         <w:pStyle w:val="BodyText"/>
       </w:pPr>
       <w:r>
-        <w:t xml:space="preserve">RStudio shows</w:t>
-      </w:r>
-      <w:r>
-        <w:t xml:space="preserve"> </w:t>
-      </w:r>
-      <w:r>
-        <w:rPr>
+        <w:rPr>
+          <w:bCs/>
           <w:b/>
+        </w:rPr>
+        <w:t xml:space="preserve">Why it happens</w:t>
+      </w:r>
+    </w:p>
+    <w:p>
+      <w:pPr>
+        <w:pStyle w:val="BodyText"/>
+      </w:pPr>
+      <w:r>
+        <w:t xml:space="preserve">Almost always the session ran out of its memory share and was stopped</w:t>
+      </w:r>
+      <w:r>
+        <w:t xml:space="preserve"> </w:t>
+      </w:r>
+      <w:r>
+        <w:t xml:space="preserve">(section 3). Saving the workspace on exit is switched off on this server</w:t>
+      </w:r>
+      <w:r>
+        <w:t xml:space="preserve"> </w:t>
+      </w:r>
+      <w:r>
+        <w:t xml:space="preserve">for this reason, but loading a very large</w:t>
+      </w:r>
+      <w:r>
+        <w:t xml:space="preserve"> </w:t>
+      </w:r>
+      <w:r>
+        <w:rPr>
+          <w:rStyle w:val="VerbatimChar"/>
+        </w:rPr>
+        <w:t xml:space="preserve">.RData</w:t>
+      </w:r>
+      <w:r>
+        <w:t xml:space="preserve"> </w:t>
+      </w:r>
+      <w:r>
+        <w:t xml:space="preserve">file yourself can still</w:t>
+      </w:r>
+      <w:r>
+        <w:t xml:space="preserve"> </w:t>
+      </w:r>
+      <w:r>
+        <w:t xml:space="preserve">crash the browser.</w:t>
+      </w:r>
+    </w:p>
+    <w:p>
+      <w:pPr>
+        <w:pStyle w:val="BodyText"/>
+      </w:pPr>
+      <w:r>
+        <w:rPr>
           <w:bCs/>
-        </w:rPr>
-        <w:t xml:space="preserve">"R session aborted"</w:t>
-      </w:r>
-      <w:r>
-        <w:t xml:space="preserve"> </w:t>
-      </w:r>
-      <w:r>
-        <w:t xml:space="preserve">and restarts with an empty</w:t>
-      </w:r>
-      <w:r>
-        <w:t xml:space="preserve"> </w:t>
-      </w:r>
-      <w:r>
-        <w:t xml:space="preserve">environment. Your next session may start with:</w:t>
-      </w:r>
-    </w:p>
-    <w:p>
-      <w:pPr>
-        <w:pStyle w:val="SourceCode"/>
-      </w:pPr>
-      <w:r>
-        <w:rPr>
-          <w:rStyle w:val="VerbatimChar"/>
-        </w:rPr>
-        <w:t xml:space="preserve">WARNING: Previous session killed by OOM</w:t>
-      </w:r>
-    </w:p>
-    <w:p>
-      <w:pPr>
-        <w:pStyle w:val="FirstParagraph"/>
-      </w:pPr>
-      <w:r>
-        <w:t xml:space="preserve">Sometimes the browser tab crashes instead ("Aw, Snap!"), usually when</w:t>
-      </w:r>
-      <w:r>
-        <w:t xml:space="preserve"> </w:t>
-      </w:r>
-      <w:r>
-        <w:t xml:space="preserve">RStudio reloads a very large workspace.</w:t>
-      </w:r>
-    </w:p>
-    <w:p>
-      <w:pPr>
-        <w:pStyle w:val="BodyText"/>
-      </w:pPr>
-      <w:r>
-        <w:rPr>
           <w:b/>
-          <w:bCs/>
-        </w:rPr>
-        <w:t xml:space="preserve">Why it happens</w:t>
-      </w:r>
-    </w:p>
-    <w:p>
-      <w:pPr>
-        <w:pStyle w:val="BodyText"/>
-      </w:pPr>
-      <w:r>
-        <w:t xml:space="preserve">Almost always the session ran out of its memory share and was stopped</w:t>
-      </w:r>
-      <w:r>
-        <w:t xml:space="preserve"> </w:t>
-      </w:r>
-      <w:r>
-        <w:t xml:space="preserve">(section 3). Saving the workspace on exit is switched off on this server</w:t>
-      </w:r>
-      <w:r>
-        <w:t xml:space="preserve"> </w:t>
-      </w:r>
-      <w:r>
-        <w:t xml:space="preserve">for this reason, but loading a very large</w:t>
-      </w:r>
-      <w:r>
-        <w:t xml:space="preserve"> </w:t>
-      </w:r>
-      <w:r>
-        <w:rPr>
-          <w:rStyle w:val="VerbatimChar"/>
-        </w:rPr>
-        <w:t xml:space="preserve">.RData</w:t>
-      </w:r>
-      <w:r>
-        <w:t xml:space="preserve"> </w:t>
-      </w:r>
-      <w:r>
-        <w:t xml:space="preserve">file yourself can still</w:t>
-      </w:r>
-      <w:r>
-        <w:t xml:space="preserve"> </w:t>
-      </w:r>
-      <w:r>
-        <w:t xml:space="preserve">crash the browser.</w:t>
-      </w:r>
-    </w:p>
-    <w:p>
-      <w:pPr>
-        <w:pStyle w:val="BodyText"/>
-      </w:pPr>
-      <w:r>
-        <w:rPr>
-          <w:b/>
-          <w:bCs/>
         </w:rPr>
         <w:t xml:space="preserve">What you can do</w:t>
       </w:r>
     </w:p>
     <w:p>
       <w:pPr>
-        <w:pStyle w:val="Compact"/>
         <w:numPr>
           <w:ilvl w:val="0"/>
           <w:numId w:val="1004"/>
         </w:numPr>
+        <w:pStyle w:val="Compact"/>
       </w:pPr>
       <w:r>
         <w:t xml:space="preserve">Anything that was only in memory is lost; what you saved to disk is safe.</w:t>
@@ -2140,11 +2166,11 @@
     </w:p>
     <w:p>
       <w:pPr>
-        <w:pStyle w:val="Compact"/>
         <w:numPr>
           <w:ilvl w:val="0"/>
           <w:numId w:val="1004"/>
         </w:numPr>
+        <w:pStyle w:val="Compact"/>
       </w:pPr>
       <w:r>
         <w:t xml:space="preserve">If you used</w:t>
@@ -2182,11 +2208,11 @@
     </w:p>
     <w:p>
       <w:pPr>
-        <w:pStyle w:val="Compact"/>
         <w:numPr>
           <w:ilvl w:val="0"/>
           <w:numId w:val="1004"/>
         </w:numPr>
+        <w:pStyle w:val="Compact"/>
       </w:pPr>
       <w:r>
         <w:t xml:space="preserve">In long scripts, save results step by step with</w:t>
@@ -2206,11 +2232,11 @@
     </w:p>
     <w:p>
       <w:pPr>
-        <w:pStyle w:val="Compact"/>
         <w:numPr>
           <w:ilvl w:val="0"/>
           <w:numId w:val="1004"/>
         </w:numPr>
+        <w:pStyle w:val="Compact"/>
       </w:pPr>
       <w:r>
         <w:t xml:space="preserve">For long NIMBLE runs: wait until</w:t>
@@ -2243,8 +2269,8 @@
       </w:pPr>
       <w:r>
         <w:rPr>
+          <w:bCs/>
           <w:b/>
-          <w:bCs/>
         </w:rPr>
         <w:t xml:space="preserve">When to ask the admins</w:t>
       </w:r>
@@ -2313,87 +2339,120 @@
       </w:pPr>
       <w:r>
         <w:rPr>
+          <w:bCs/>
           <w:b/>
+        </w:rPr>
+        <w:t xml:space="preserve">What you see</w:t>
+      </w:r>
+    </w:p>
+    <w:p>
+      <w:pPr>
+        <w:pStyle w:val="BodyText"/>
+      </w:pPr>
+      <w:r>
+        <w:rPr>
+          <w:rStyle w:val="VerbatimChar"/>
+        </w:rPr>
+        <w:t xml:space="preserve">parallel::mclapply()</w:t>
+      </w:r>
+      <w:r>
+        <w:t xml:space="preserve"> </w:t>
+      </w:r>
+      <w:r>
+        <w:t xml:space="preserve">starts, uses no CPU and never ends. Or the workers</w:t>
+      </w:r>
+      <w:r>
+        <w:t xml:space="preserve"> </w:t>
+      </w:r>
+      <w:r>
+        <w:t xml:space="preserve">stop with:</w:t>
+      </w:r>
+    </w:p>
+    <w:p>
+      <w:pPr>
+        <w:pStyle w:val="SourceCode"/>
+      </w:pPr>
+      <w:r>
+        <w:rPr>
+          <w:rStyle w:val="VerbatimChar"/>
+        </w:rPr>
+        <w:t xml:space="preserve">Error in unserialize(node$con) : error reading from connection</w:t>
+      </w:r>
+    </w:p>
+    <w:p>
+      <w:pPr>
+        <w:pStyle w:val="FirstParagraph"/>
+      </w:pPr>
+      <w:r>
+        <w:rPr>
           <w:bCs/>
-        </w:rPr>
-        <w:t xml:space="preserve">What you see</w:t>
-      </w:r>
-    </w:p>
-    <w:p>
-      <w:pPr>
-        <w:pStyle w:val="BodyText"/>
-      </w:pPr>
-      <w:r>
-        <w:rPr>
-          <w:rStyle w:val="VerbatimChar"/>
-        </w:rPr>
-        <w:t xml:space="preserve">parallel::mclapply()</w:t>
-      </w:r>
-      <w:r>
-        <w:t xml:space="preserve"> </w:t>
-      </w:r>
-      <w:r>
-        <w:t xml:space="preserve">starts, uses no CPU and never ends. Or the workers</w:t>
-      </w:r>
-      <w:r>
-        <w:t xml:space="preserve"> </w:t>
-      </w:r>
-      <w:r>
-        <w:t xml:space="preserve">stop with:</w:t>
-      </w:r>
-    </w:p>
-    <w:p>
-      <w:pPr>
-        <w:pStyle w:val="SourceCode"/>
-      </w:pPr>
-      <w:r>
-        <w:rPr>
-          <w:rStyle w:val="VerbatimChar"/>
-        </w:rPr>
-        <w:t xml:space="preserve">Error in unserialize(node$con) : error reading from connection</w:t>
-      </w:r>
-    </w:p>
-    <w:p>
-      <w:pPr>
-        <w:pStyle w:val="FirstParagraph"/>
-      </w:pPr>
-      <w:r>
-        <w:rPr>
           <w:b/>
-          <w:bCs/>
         </w:rPr>
         <w:t xml:space="preserve">Why it happens</w:t>
       </w:r>
     </w:p>
     <w:p>
       <w:pPr>
-        <w:pStyle w:val="Compact"/>
         <w:numPr>
           <w:ilvl w:val="0"/>
           <w:numId w:val="1005"/>
         </w:numPr>
-      </w:pPr>
-      <w:r>
-        <w:rPr>
-          <w:rStyle w:val="VerbatimChar"/>
+        <w:pStyle w:val="Compact"/>
+      </w:pPr>
+      <w:r>
+        <w:rPr>
+          <w:rStyle w:val="VerbatimChar"/>
+          <w:bCs/>
           <w:b/>
+        </w:rPr>
+        <w:t xml:space="preserve">mclapply()</w:t>
+      </w:r>
+      <w:r>
+        <w:rPr>
           <w:bCs/>
+          <w:b/>
+        </w:rPr>
+        <w:t xml:space="preserve"> </w:t>
+      </w:r>
+      <w:r>
+        <w:rPr>
+          <w:bCs/>
+          <w:b/>
+        </w:rPr>
+        <w:t xml:space="preserve">with spatial packages.</w:t>
+      </w:r>
+      <w:r>
+        <w:t xml:space="preserve"> </w:t>
+      </w:r>
+      <w:r>
+        <w:rPr>
+          <w:rStyle w:val="VerbatimChar"/>
         </w:rPr>
         <w:t xml:space="preserve">mclapply()</w:t>
       </w:r>
       <w:r>
-        <w:rPr>
-          <w:b/>
-          <w:bCs/>
-        </w:rPr>
-        <w:t xml:space="preserve"> </w:t>
-      </w:r>
-      <w:r>
-        <w:rPr>
-          <w:b/>
-          <w:bCs/>
-        </w:rPr>
-        <w:t xml:space="preserve">with spatial packages.</w:t>
+        <w:t xml:space="preserve"> </w:t>
+      </w:r>
+      <w:r>
+        <w:t xml:space="preserve">copies the running R</w:t>
+      </w:r>
+      <w:r>
+        <w:t xml:space="preserve"> </w:t>
+      </w:r>
+      <w:r>
+        <w:t xml:space="preserve">session. Packages such as terra, sf and GDAL do not survive being copied</w:t>
+      </w:r>
+      <w:r>
+        <w:t xml:space="preserve"> </w:t>
+      </w:r>
+      <w:r>
+        <w:t xml:space="preserve">and can freeze. The server already protects you: when those packages</w:t>
+      </w:r>
+      <w:r>
+        <w:t xml:space="preserve"> </w:t>
+      </w:r>
+      <w:r>
+        <w:t xml:space="preserve">are loaded,</w:t>
       </w:r>
       <w:r>
         <w:t xml:space="preserve"> </w:t>
@@ -2408,111 +2467,78 @@
         <w:t xml:space="preserve"> </w:t>
       </w:r>
       <w:r>
-        <w:t xml:space="preserve">copies the running R</w:t>
-      </w:r>
-      <w:r>
-        <w:t xml:space="preserve"> </w:t>
-      </w:r>
-      <w:r>
-        <w:t xml:space="preserve">session. Packages such as terra, sf and GDAL do not survive being copied</w:t>
-      </w:r>
-      <w:r>
-        <w:t xml:space="preserve"> </w:t>
-      </w:r>
-      <w:r>
-        <w:t xml:space="preserve">and can freeze. The server already protects you: when those packages</w:t>
-      </w:r>
-      <w:r>
-        <w:t xml:space="preserve"> </w:t>
-      </w:r>
-      <w:r>
-        <w:t xml:space="preserve">are loaded,</w:t>
-      </w:r>
-      <w:r>
-        <w:t xml:space="preserve"> </w:t>
-      </w:r>
-      <w:r>
-        <w:rPr>
-          <w:rStyle w:val="VerbatimChar"/>
-        </w:rPr>
-        <w:t xml:space="preserve">mclapply()</w:t>
-      </w:r>
-      <w:r>
-        <w:t xml:space="preserve"> </w:t>
-      </w:r>
-      <w:r>
         <w:t xml:space="preserve">is switched to a safe cluster automatically.</w:t>
       </w:r>
     </w:p>
     <w:p>
       <w:pPr>
-        <w:pStyle w:val="Compact"/>
         <w:numPr>
           <w:ilvl w:val="0"/>
           <w:numId w:val="1005"/>
         </w:numPr>
-      </w:pPr>
-      <w:r>
-        <w:rPr>
+        <w:pStyle w:val="Compact"/>
+      </w:pPr>
+      <w:r>
+        <w:rPr>
+          <w:bCs/>
           <w:b/>
+        </w:rPr>
+        <w:t xml:space="preserve">Sending compiled objects to workers.</w:t>
+      </w:r>
+      <w:r>
+        <w:t xml:space="preserve"> </w:t>
+      </w:r>
+      <w:r>
+        <w:t xml:space="preserve">Compiled NIMBLE/Stan/TMB models</w:t>
+      </w:r>
+      <w:r>
+        <w:t xml:space="preserve"> </w:t>
+      </w:r>
+      <w:r>
+        <w:t xml:space="preserve">and</w:t>
+      </w:r>
+      <w:r>
+        <w:t xml:space="preserve"> </w:t>
+      </w:r>
+      <w:r>
+        <w:rPr>
+          <w:rStyle w:val="VerbatimChar"/>
+        </w:rPr>
+        <w:t xml:space="preserve">terra</w:t>
+      </w:r>
+      <w:r>
+        <w:t xml:space="preserve"> </w:t>
+      </w:r>
+      <w:r>
+        <w:t xml:space="preserve">rasters live outside R's memory and cannot be sent to another</w:t>
+      </w:r>
+      <w:r>
+        <w:t xml:space="preserve"> </w:t>
+      </w:r>
+      <w:r>
+        <w:t xml:space="preserve">process (see</w:t>
+      </w:r>
+      <w:r>
+        <w:t xml:space="preserve"> </w:t>
+      </w:r>
+      <w:r>
+        <w:rPr>
+          <w:rStyle w:val="VerbatimChar"/>
+        </w:rPr>
+        <w:t xml:space="preserve">?serialize</w:t>
+      </w:r>
+      <w:r>
+        <w:t xml:space="preserve">). Each worker must load or compile its own copy.</w:t>
+      </w:r>
+    </w:p>
+    <w:p>
+      <w:pPr>
+        <w:pStyle w:val="FirstParagraph"/>
+      </w:pPr>
+      <w:r>
+        <w:rPr>
           <w:bCs/>
-        </w:rPr>
-        <w:t xml:space="preserve">Sending compiled objects to workers.</w:t>
-      </w:r>
-      <w:r>
-        <w:t xml:space="preserve"> </w:t>
-      </w:r>
-      <w:r>
-        <w:t xml:space="preserve">Compiled NIMBLE/Stan/TMB models</w:t>
-      </w:r>
-      <w:r>
-        <w:t xml:space="preserve"> </w:t>
-      </w:r>
-      <w:r>
-        <w:t xml:space="preserve">and</w:t>
-      </w:r>
-      <w:r>
-        <w:t xml:space="preserve"> </w:t>
-      </w:r>
-      <w:r>
-        <w:rPr>
-          <w:rStyle w:val="VerbatimChar"/>
-        </w:rPr>
-        <w:t xml:space="preserve">terra</w:t>
-      </w:r>
-      <w:r>
-        <w:t xml:space="preserve"> </w:t>
-      </w:r>
-      <w:r>
-        <w:t xml:space="preserve">rasters live outside R's memory and cannot be sent to another</w:t>
-      </w:r>
-      <w:r>
-        <w:t xml:space="preserve"> </w:t>
-      </w:r>
-      <w:r>
-        <w:t xml:space="preserve">process (see</w:t>
-      </w:r>
-      <w:r>
-        <w:t xml:space="preserve"> </w:t>
-      </w:r>
-      <w:r>
-        <w:rPr>
-          <w:rStyle w:val="VerbatimChar"/>
-        </w:rPr>
-        <w:t xml:space="preserve">?serialize</w:t>
-      </w:r>
-      <w:r>
-        <w:t xml:space="preserve">). Each worker must load or compile its own copy.</w:t>
-      </w:r>
-    </w:p>
-    <w:p>
-      <w:pPr>
-        <w:pStyle w:val="FirstParagraph"/>
-      </w:pPr>
-      <w:r>
-        <w:rPr>
           <w:b/>
-          <w:bCs/>
         </w:rPr>
         <w:t xml:space="preserve">What you can do</w:t>
       </w:r>
@@ -2532,8 +2558,8 @@
       </w:r>
       <w:r>
         <w:rPr>
+          <w:iCs/>
           <w:i/>
-          <w:iCs/>
         </w:rPr>
         <w:t xml:space="preserve">inside</w:t>
       </w:r>
@@ -2546,11 +2572,11 @@
     </w:p>
     <w:p>
       <w:pPr>
-        <w:pStyle w:val="SourceCode"/>
         <w:numPr>
           <w:ilvl w:val="0"/>
           <w:numId w:val="1000"/>
         </w:numPr>
+        <w:pStyle w:val="SourceCode"/>
       </w:pPr>
       <w:r>
         <w:rPr>
@@ -2949,8 +2975,8 @@
       </w:r>
       <w:r>
         <w:rPr>
+          <w:iCs/>
           <w:i/>
-          <w:iCs/>
         </w:rPr>
         <w:t xml:space="preserve">Safe Parallel R — Do's and Don'ts</w:t>
       </w:r>
@@ -2964,8 +2990,8 @@
       </w:pPr>
       <w:r>
         <w:rPr>
+          <w:bCs/>
           <w:b/>
-          <w:bCs/>
         </w:rPr>
         <w:t xml:space="preserve">When to ask the admins</w:t>
       </w:r>
@@ -3034,60 +3060,126 @@
       </w:pPr>
       <w:r>
         <w:rPr>
+          <w:bCs/>
           <w:b/>
+        </w:rPr>
+        <w:t xml:space="preserve">What you see</w:t>
+      </w:r>
+    </w:p>
+    <w:p>
+      <w:pPr>
+        <w:pStyle w:val="SourceCode"/>
+      </w:pPr>
+      <w:r>
+        <w:rPr>
+          <w:rStyle w:val="NormalTok"/>
+        </w:rPr>
+        <w:t xml:space="preserve">parallel</w:t>
+      </w:r>
+      <w:r>
+        <w:rPr>
+          <w:rStyle w:val="SpecialCharTok"/>
+        </w:rPr>
+        <w:t xml:space="preserve">::</w:t>
+      </w:r>
+      <w:r>
+        <w:rPr>
+          <w:rStyle w:val="FunctionTok"/>
+        </w:rPr>
+        <w:t xml:space="preserve">detectCores</w:t>
+      </w:r>
+      <w:r>
+        <w:rPr>
+          <w:rStyle w:val="NormalTok"/>
+        </w:rPr>
+        <w:t xml:space="preserve">()</w:t>
+      </w:r>
+      <w:r>
+        <w:br/>
+      </w:r>
+      <w:r>
+        <w:rPr>
+          <w:rStyle w:val="CommentTok"/>
+        </w:rPr>
+        <w:t xml:space="preserve"># [1] 8        # on a server with many more cores</w:t>
+      </w:r>
+    </w:p>
+    <w:p>
+      <w:pPr>
+        <w:pStyle w:val="FirstParagraph"/>
+      </w:pPr>
+      <w:r>
+        <w:rPr>
           <w:bCs/>
-        </w:rPr>
-        <w:t xml:space="preserve">What you see</w:t>
-      </w:r>
-    </w:p>
-    <w:p>
-      <w:pPr>
-        <w:pStyle w:val="SourceCode"/>
-      </w:pPr>
-      <w:r>
-        <w:rPr>
-          <w:rStyle w:val="NormalTok"/>
-        </w:rPr>
-        <w:t xml:space="preserve">parallel</w:t>
-      </w:r>
-      <w:r>
-        <w:rPr>
-          <w:rStyle w:val="SpecialCharTok"/>
-        </w:rPr>
-        <w:t xml:space="preserve">::</w:t>
-      </w:r>
-      <w:r>
-        <w:rPr>
-          <w:rStyle w:val="FunctionTok"/>
-        </w:rPr>
-        <w:t xml:space="preserve">detectCores</w:t>
-      </w:r>
-      <w:r>
-        <w:rPr>
-          <w:rStyle w:val="NormalTok"/>
-        </w:rPr>
-        <w:t xml:space="preserve">()</w:t>
-      </w:r>
-      <w:r>
-        <w:br/>
-      </w:r>
-      <w:r>
-        <w:rPr>
-          <w:rStyle w:val="CommentTok"/>
-        </w:rPr>
-        <w:t xml:space="preserve"># [1] 8        # on a server with many more cores</w:t>
-      </w:r>
-    </w:p>
-    <w:p>
-      <w:pPr>
-        <w:pStyle w:val="FirstParagraph"/>
-      </w:pPr>
-      <w:r>
-        <w:rPr>
           <w:b/>
+        </w:rPr>
+        <w:t xml:space="preserve">Why it happens</w:t>
+      </w:r>
+    </w:p>
+    <w:p>
+      <w:pPr>
+        <w:pStyle w:val="BodyText"/>
+      </w:pPr>
+      <w:r>
+        <w:t xml:space="preserve">This is on purpose. Each user gets a fair share of the processors, and</w:t>
+      </w:r>
+      <w:r>
+        <w:t xml:space="preserve"> </w:t>
+      </w:r>
+      <w:r>
+        <w:rPr>
+          <w:rStyle w:val="VerbatimChar"/>
+        </w:rPr>
+        <w:t xml:space="preserve">detectCores()</w:t>
+      </w:r>
+      <w:r>
+        <w:t xml:space="preserve"> </w:t>
+      </w:r>
+      <w:r>
+        <w:t xml:space="preserve">returns</w:t>
+      </w:r>
+      <w:r>
+        <w:t xml:space="preserve"> </w:t>
+      </w:r>
+      <w:r>
+        <w:rPr>
           <w:bCs/>
-        </w:rPr>
-        <w:t xml:space="preserve">Why it happens</w:t>
+          <w:b/>
+        </w:rPr>
+        <w:t xml:space="preserve">your</w:t>
+      </w:r>
+      <w:r>
+        <w:t xml:space="preserve"> </w:t>
+      </w:r>
+      <w:r>
+        <w:t xml:space="preserve">share. The same script on your laptop</w:t>
+      </w:r>
+      <w:r>
+        <w:t xml:space="preserve"> </w:t>
+      </w:r>
+      <w:r>
+        <w:t xml:space="preserve">returns the laptop's cores, so your code works in both places without</w:t>
+      </w:r>
+      <w:r>
+        <w:t xml:space="preserve"> </w:t>
+      </w:r>
+      <w:r>
+        <w:t xml:space="preserve">changes.</w:t>
+      </w:r>
+      <w:r>
+        <w:t xml:space="preserve"> </w:t>
+      </w:r>
+      <w:r>
+        <w:rPr>
+          <w:rStyle w:val="VerbatimChar"/>
+        </w:rPr>
+        <w:t xml:space="preserve">options(mc.cores = ...)</w:t>
+      </w:r>
+      <w:r>
+        <w:t xml:space="preserve"> </w:t>
+      </w:r>
+      <w:r>
+        <w:t xml:space="preserve">is limited to your share in the same way.</w:t>
       </w:r>
     </w:p>
     <w:p>
@@ -3095,75 +3187,9 @@
         <w:pStyle w:val="BodyText"/>
       </w:pPr>
       <w:r>
-        <w:t xml:space="preserve">This is on purpose. Each user gets a fair share of the processors, and</w:t>
-      </w:r>
-      <w:r>
-        <w:t xml:space="preserve"> </w:t>
-      </w:r>
-      <w:r>
-        <w:rPr>
-          <w:rStyle w:val="VerbatimChar"/>
-        </w:rPr>
-        <w:t xml:space="preserve">detectCores()</w:t>
-      </w:r>
-      <w:r>
-        <w:t xml:space="preserve"> </w:t>
-      </w:r>
-      <w:r>
-        <w:t xml:space="preserve">returns</w:t>
-      </w:r>
-      <w:r>
-        <w:t xml:space="preserve"> </w:t>
-      </w:r>
-      <w:r>
-        <w:rPr>
+        <w:rPr>
+          <w:bCs/>
           <w:b/>
-          <w:bCs/>
-        </w:rPr>
-        <w:t xml:space="preserve">your</w:t>
-      </w:r>
-      <w:r>
-        <w:t xml:space="preserve"> </w:t>
-      </w:r>
-      <w:r>
-        <w:t xml:space="preserve">share. The same script on your laptop</w:t>
-      </w:r>
-      <w:r>
-        <w:t xml:space="preserve"> </w:t>
-      </w:r>
-      <w:r>
-        <w:t xml:space="preserve">returns the laptop's cores, so your code works in both places without</w:t>
-      </w:r>
-      <w:r>
-        <w:t xml:space="preserve"> </w:t>
-      </w:r>
-      <w:r>
-        <w:t xml:space="preserve">changes.</w:t>
-      </w:r>
-      <w:r>
-        <w:t xml:space="preserve"> </w:t>
-      </w:r>
-      <w:r>
-        <w:rPr>
-          <w:rStyle w:val="VerbatimChar"/>
-        </w:rPr>
-        <w:t xml:space="preserve">options(mc.cores = ...)</w:t>
-      </w:r>
-      <w:r>
-        <w:t xml:space="preserve"> </w:t>
-      </w:r>
-      <w:r>
-        <w:t xml:space="preserve">is limited to your share in the same way.</w:t>
-      </w:r>
-    </w:p>
-    <w:p>
-      <w:pPr>
-        <w:pStyle w:val="BodyText"/>
-      </w:pPr>
-      <w:r>
-        <w:rPr>
-          <w:b/>
-          <w:bCs/>
         </w:rPr>
         <w:t xml:space="preserve">What you can do</w:t>
       </w:r>
@@ -3196,11 +3222,11 @@
     </w:p>
     <w:p>
       <w:pPr>
-        <w:pStyle w:val="SourceCode"/>
         <w:numPr>
           <w:ilvl w:val="0"/>
           <w:numId w:val="1000"/>
         </w:numPr>
+        <w:pStyle w:val="SourceCode"/>
       </w:pPr>
       <w:r>
         <w:rPr>
@@ -3364,8 +3390,8 @@
       </w:pPr>
       <w:r>
         <w:rPr>
+          <w:bCs/>
           <w:b/>
-          <w:bCs/>
         </w:rPr>
         <w:t xml:space="preserve">When to ask the admins</w:t>
       </w:r>
@@ -3434,108 +3460,108 @@
       </w:pPr>
       <w:r>
         <w:rPr>
+          <w:bCs/>
           <w:b/>
+        </w:rPr>
+        <w:t xml:space="preserve">What you see</w:t>
+      </w:r>
+    </w:p>
+    <w:p>
+      <w:pPr>
+        <w:pStyle w:val="SourceCode"/>
+      </w:pPr>
+      <w:r>
+        <w:rPr>
+          <w:rStyle w:val="VerbatimChar"/>
+        </w:rPr>
+        <w:t xml:space="preserve">Warning in install.packages :</w:t>
+      </w:r>
+      <w:r>
+        <w:br/>
+      </w:r>
+      <w:r>
+        <w:rPr>
+          <w:rStyle w:val="VerbatimChar"/>
+        </w:rPr>
+        <w:t xml:space="preserve">  'lib = "/var/lib/biome-Rlibs/you/4.5"' is not writable</w:t>
+      </w:r>
+    </w:p>
+    <w:p>
+      <w:pPr>
+        <w:pStyle w:val="SourceCode"/>
+      </w:pPr>
+      <w:r>
+        <w:rPr>
+          <w:rStyle w:val="VerbatimChar"/>
+        </w:rPr>
+        <w:t xml:space="preserve">Error in library(foo) : there is no package called 'foo'</w:t>
+      </w:r>
+    </w:p>
+    <w:p>
+      <w:pPr>
+        <w:pStyle w:val="FirstParagraph"/>
+      </w:pPr>
+      <w:r>
+        <w:t xml:space="preserve">or, only during periods when installing has been switched off centrally:</w:t>
+      </w:r>
+    </w:p>
+    <w:p>
+      <w:pPr>
+        <w:pStyle w:val="SourceCode"/>
+      </w:pPr>
+      <w:r>
+        <w:rPr>
+          <w:rStyle w:val="VerbatimChar"/>
+        </w:rPr>
+        <w:t xml:space="preserve">BIOME-CALC: install.packages() is disabled on this cluster.</w:t>
+      </w:r>
+      <w:r>
+        <w:br/>
+      </w:r>
+      <w:r>
+        <w:rPr>
+          <w:rStyle w:val="VerbatimChar"/>
+        </w:rPr>
+        <w:t xml:space="preserve">            Ask the sysadmin to add 'foo' to</w:t>
+      </w:r>
+      <w:r>
+        <w:br/>
+      </w:r>
+      <w:r>
+        <w:rPr>
+          <w:rStyle w:val="VerbatimChar"/>
+        </w:rPr>
+        <w:t xml:space="preserve">            config/r_env_manager.conf :: R_USER_PACKAGES_CRAN,</w:t>
+      </w:r>
+      <w:r>
+        <w:br/>
+      </w:r>
+      <w:r>
+        <w:rPr>
+          <w:rStyle w:val="VerbatimChar"/>
+        </w:rPr>
+        <w:t xml:space="preserve">            then re-run.</w:t>
+      </w:r>
+    </w:p>
+    <w:p>
+      <w:pPr>
+        <w:pStyle w:val="FirstParagraph"/>
+      </w:pPr>
+      <w:r>
+        <w:rPr>
           <w:bCs/>
-        </w:rPr>
-        <w:t xml:space="preserve">What you see</w:t>
-      </w:r>
-    </w:p>
-    <w:p>
-      <w:pPr>
-        <w:pStyle w:val="SourceCode"/>
-      </w:pPr>
-      <w:r>
-        <w:rPr>
-          <w:rStyle w:val="VerbatimChar"/>
-        </w:rPr>
-        <w:t xml:space="preserve">Warning in install.packages :</w:t>
-      </w:r>
-      <w:r>
-        <w:br/>
-      </w:r>
-      <w:r>
-        <w:rPr>
-          <w:rStyle w:val="VerbatimChar"/>
-        </w:rPr>
-        <w:t xml:space="preserve">  'lib = "/var/lib/biome-Rlibs/you/4.5"' is not writable</w:t>
-      </w:r>
-    </w:p>
-    <w:p>
-      <w:pPr>
-        <w:pStyle w:val="SourceCode"/>
-      </w:pPr>
-      <w:r>
-        <w:rPr>
-          <w:rStyle w:val="VerbatimChar"/>
-        </w:rPr>
-        <w:t xml:space="preserve">Error in library(foo) : there is no package called 'foo'</w:t>
-      </w:r>
-    </w:p>
-    <w:p>
-      <w:pPr>
-        <w:pStyle w:val="FirstParagraph"/>
-      </w:pPr>
-      <w:r>
-        <w:t xml:space="preserve">or, only during periods when installing has been switched off centrally:</w:t>
-      </w:r>
-    </w:p>
-    <w:p>
-      <w:pPr>
-        <w:pStyle w:val="SourceCode"/>
-      </w:pPr>
-      <w:r>
-        <w:rPr>
-          <w:rStyle w:val="VerbatimChar"/>
-        </w:rPr>
-        <w:t xml:space="preserve">BIOME-CALC: install.packages() is disabled on this cluster.</w:t>
-      </w:r>
-      <w:r>
-        <w:br/>
-      </w:r>
-      <w:r>
-        <w:rPr>
-          <w:rStyle w:val="VerbatimChar"/>
-        </w:rPr>
-        <w:t xml:space="preserve">            Ask the sysadmin to add 'foo' to</w:t>
-      </w:r>
-      <w:r>
-        <w:br/>
-      </w:r>
-      <w:r>
-        <w:rPr>
-          <w:rStyle w:val="VerbatimChar"/>
-        </w:rPr>
-        <w:t xml:space="preserve">            config/r_env_manager.conf :: R_USER_PACKAGES_CRAN,</w:t>
-      </w:r>
-      <w:r>
-        <w:br/>
-      </w:r>
-      <w:r>
-        <w:rPr>
-          <w:rStyle w:val="VerbatimChar"/>
-        </w:rPr>
-        <w:t xml:space="preserve">            then re-run.</w:t>
-      </w:r>
-    </w:p>
-    <w:p>
-      <w:pPr>
-        <w:pStyle w:val="FirstParagraph"/>
-      </w:pPr>
-      <w:r>
-        <w:rPr>
           <w:b/>
-          <w:bCs/>
         </w:rPr>
         <w:t xml:space="preserve">Why it happens</w:t>
       </w:r>
     </w:p>
     <w:p>
       <w:pPr>
-        <w:pStyle w:val="Compact"/>
         <w:numPr>
           <w:ilvl w:val="0"/>
           <w:numId w:val="1008"/>
         </w:numPr>
+        <w:pStyle w:val="Compact"/>
       </w:pPr>
       <w:r>
         <w:t xml:space="preserve">Your packages go into your own library on the server. Packages installed</w:t>
@@ -3549,11 +3575,11 @@
     </w:p>
     <w:p>
       <w:pPr>
-        <w:pStyle w:val="Compact"/>
         <w:numPr>
           <w:ilvl w:val="0"/>
           <w:numId w:val="1008"/>
         </w:numPr>
+        <w:pStyle w:val="Compact"/>
       </w:pPr>
       <w:r>
         <w:t xml:space="preserve">"There is no package called" after you installed it some time ago usually</w:t>
@@ -3573,11 +3599,11 @@
     </w:p>
     <w:p>
       <w:pPr>
-        <w:pStyle w:val="Compact"/>
         <w:numPr>
           <w:ilvl w:val="0"/>
           <w:numId w:val="1008"/>
         </w:numPr>
+        <w:pStyle w:val="Compact"/>
       </w:pPr>
       <w:r>
         <w:t xml:space="preserve">The last message means the admins have temporarily centralised package</w:t>
@@ -3595,8 +3621,8 @@
       </w:pPr>
       <w:r>
         <w:rPr>
+          <w:bCs/>
           <w:b/>
-          <w:bCs/>
         </w:rPr>
         <w:t xml:space="preserve">What you can do</w:t>
       </w:r>
@@ -3614,11 +3640,11 @@
     </w:p>
     <w:p>
       <w:pPr>
-        <w:pStyle w:val="SourceCode"/>
         <w:numPr>
           <w:ilvl w:val="0"/>
           <w:numId w:val="1000"/>
         </w:numPr>
+        <w:pStyle w:val="SourceCode"/>
       </w:pPr>
       <w:r>
         <w:rPr>
@@ -3646,11 +3672,11 @@
     </w:p>
     <w:p>
       <w:pPr>
-        <w:pStyle w:val="SourceCode"/>
         <w:numPr>
           <w:ilvl w:val="0"/>
           <w:numId w:val="1000"/>
         </w:numPr>
+        <w:pStyle w:val="SourceCode"/>
       </w:pPr>
       <w:r>
         <w:rPr>
@@ -3721,8 +3747,8 @@
       </w:pPr>
       <w:r>
         <w:rPr>
+          <w:bCs/>
           <w:b/>
-          <w:bCs/>
         </w:rPr>
         <w:t xml:space="preserve">When to ask the admins</w:t>
       </w:r>
@@ -3782,69 +3808,160 @@
       </w:pPr>
       <w:r>
         <w:rPr>
+          <w:bCs/>
           <w:b/>
+        </w:rPr>
+        <w:t xml:space="preserve">What you see</w:t>
+      </w:r>
+    </w:p>
+    <w:p>
+      <w:pPr>
+        <w:pStyle w:val="SourceCode"/>
+      </w:pPr>
+      <w:r>
+        <w:rPr>
+          <w:rStyle w:val="VerbatimChar"/>
+        </w:rPr>
+        <w:t xml:space="preserve">Warning message:</w:t>
+      </w:r>
+      <w:r>
+        <w:br/>
+      </w:r>
+      <w:r>
+        <w:rPr>
+          <w:rStyle w:val="VerbatimChar"/>
+        </w:rPr>
+        <w:t xml:space="preserve">BIOME-CALC safe_setwd: target directory does not exist: '/nfs/home/you/projet'</w:t>
+      </w:r>
+      <w:r>
+        <w:br/>
+      </w:r>
+      <w:r>
+        <w:rPr>
+          <w:rStyle w:val="VerbatimChar"/>
+        </w:rPr>
+        <w:t xml:space="preserve">  cwd remains: /nfs/home/you</w:t>
+      </w:r>
+      <w:r>
+        <w:br/>
+      </w:r>
+      <w:r>
+        <w:rPr>
+          <w:rStyle w:val="VerbatimChar"/>
+        </w:rPr>
+        <w:t xml:space="preserve">  This guard prevents the 'unserialize(node$con)' class of bug.</w:t>
+      </w:r>
+      <w:r>
+        <w:br/>
+      </w:r>
+      <w:r>
+        <w:rPr>
+          <w:rStyle w:val="VerbatimChar"/>
+        </w:rPr>
+        <w:t xml:space="preserve">  To override (not recommended): options(biome.strict_setwd = FALSE)</w:t>
+      </w:r>
+    </w:p>
+    <w:p>
+      <w:pPr>
+        <w:pStyle w:val="FirstParagraph"/>
+      </w:pPr>
+      <w:r>
+        <w:rPr>
           <w:bCs/>
-        </w:rPr>
-        <w:t xml:space="preserve">What you see</w:t>
-      </w:r>
-    </w:p>
-    <w:p>
-      <w:pPr>
-        <w:pStyle w:val="SourceCode"/>
-      </w:pPr>
-      <w:r>
-        <w:rPr>
-          <w:rStyle w:val="VerbatimChar"/>
-        </w:rPr>
-        <w:t xml:space="preserve">Warning message:</w:t>
-      </w:r>
-      <w:r>
-        <w:br/>
-      </w:r>
-      <w:r>
-        <w:rPr>
-          <w:rStyle w:val="VerbatimChar"/>
-        </w:rPr>
-        <w:t xml:space="preserve">BIOME-CALC safe_setwd: target directory does not exist: '/nfs/home/you/projet'</w:t>
-      </w:r>
-      <w:r>
-        <w:br/>
-      </w:r>
-      <w:r>
-        <w:rPr>
-          <w:rStyle w:val="VerbatimChar"/>
-        </w:rPr>
-        <w:t xml:space="preserve">  cwd remains: /nfs/home/you</w:t>
-      </w:r>
-      <w:r>
-        <w:br/>
-      </w:r>
-      <w:r>
-        <w:rPr>
-          <w:rStyle w:val="VerbatimChar"/>
-        </w:rPr>
-        <w:t xml:space="preserve">  This guard prevents the 'unserialize(node$con)' class of bug.</w:t>
-      </w:r>
-      <w:r>
-        <w:br/>
-      </w:r>
-      <w:r>
-        <w:rPr>
-          <w:rStyle w:val="VerbatimChar"/>
-        </w:rPr>
-        <w:t xml:space="preserve">  To override (not recommended): options(biome.strict_setwd = FALSE)</w:t>
-      </w:r>
-    </w:p>
-    <w:p>
-      <w:pPr>
-        <w:pStyle w:val="FirstParagraph"/>
-      </w:pPr>
-      <w:r>
-        <w:rPr>
           <w:b/>
+        </w:rPr>
+        <w:t xml:space="preserve">Why it happens</w:t>
+      </w:r>
+    </w:p>
+    <w:p>
+      <w:pPr>
+        <w:pStyle w:val="BodyText"/>
+      </w:pPr>
+      <w:r>
+        <w:t xml:space="preserve">The folder you gave</w:t>
+      </w:r>
+      <w:r>
+        <w:t xml:space="preserve"> </w:t>
+      </w:r>
+      <w:r>
+        <w:rPr>
+          <w:rStyle w:val="VerbatimChar"/>
+        </w:rPr>
+        <w:t xml:space="preserve">setwd()</w:t>
+      </w:r>
+      <w:r>
+        <w:t xml:space="preserve"> </w:t>
+      </w:r>
+      <w:r>
+        <w:t xml:space="preserve">does not exist (often a typo). In RStudio the</w:t>
+      </w:r>
+      <w:r>
+        <w:t xml:space="preserve"> </w:t>
+      </w:r>
+      <w:r>
+        <w:t xml:space="preserve">working folder</w:t>
+      </w:r>
+      <w:r>
+        <w:t xml:space="preserve"> </w:t>
+      </w:r>
+      <w:r>
+        <w:rPr>
           <w:bCs/>
-        </w:rPr>
-        <w:t xml:space="preserve">Why it happens</w:t>
+          <w:b/>
+        </w:rPr>
+        <w:t xml:space="preserve">does not change</w:t>
+      </w:r>
+      <w:r>
+        <w:t xml:space="preserve">, R only warns, and the script continues.</w:t>
+      </w:r>
+      <w:r>
+        <w:t xml:space="preserve"> </w:t>
+      </w:r>
+      <w:r>
+        <w:t xml:space="preserve">Everything it saves then goes into the</w:t>
+      </w:r>
+      <w:r>
+        <w:t xml:space="preserve"> </w:t>
+      </w:r>
+      <w:r>
+        <w:rPr>
+          <w:iCs/>
+          <w:i/>
+        </w:rPr>
+        <w:t xml:space="preserve">previous</w:t>
+      </w:r>
+      <w:r>
+        <w:t xml:space="preserve"> </w:t>
+      </w:r>
+      <w:r>
+        <w:t xml:space="preserve">folder, so your results</w:t>
+      </w:r>
+      <w:r>
+        <w:t xml:space="preserve"> </w:t>
+      </w:r>
+      <w:r>
+        <w:t xml:space="preserve">seem to disappear. In</w:t>
+      </w:r>
+      <w:r>
+        <w:t xml:space="preserve"> </w:t>
+      </w:r>
+      <w:r>
+        <w:rPr>
+          <w:rStyle w:val="VerbatimChar"/>
+        </w:rPr>
+        <w:t xml:space="preserve">Rscript</w:t>
+      </w:r>
+      <w:r>
+        <w:t xml:space="preserve"> </w:t>
+      </w:r>
+      <w:r>
+        <w:t xml:space="preserve">or in parallel workers the same mistake</w:t>
+      </w:r>
+      <w:r>
+        <w:t xml:space="preserve"> </w:t>
+      </w:r>
+      <w:r>
+        <w:t xml:space="preserve">stops the script at once.</w:t>
       </w:r>
     </w:p>
     <w:p>
@@ -3852,111 +3969,20 @@
         <w:pStyle w:val="BodyText"/>
       </w:pPr>
       <w:r>
-        <w:t xml:space="preserve">The folder you gave</w:t>
-      </w:r>
-      <w:r>
-        <w:t xml:space="preserve"> </w:t>
-      </w:r>
-      <w:r>
-        <w:rPr>
-          <w:rStyle w:val="VerbatimChar"/>
-        </w:rPr>
-        <w:t xml:space="preserve">setwd()</w:t>
-      </w:r>
-      <w:r>
-        <w:t xml:space="preserve"> </w:t>
-      </w:r>
-      <w:r>
-        <w:t xml:space="preserve">does not exist (often a typo). In RStudio the</w:t>
-      </w:r>
-      <w:r>
-        <w:t xml:space="preserve"> </w:t>
-      </w:r>
-      <w:r>
-        <w:t xml:space="preserve">working folder</w:t>
-      </w:r>
-      <w:r>
-        <w:t xml:space="preserve"> </w:t>
-      </w:r>
-      <w:r>
-        <w:rPr>
+        <w:rPr>
+          <w:bCs/>
           <w:b/>
-          <w:bCs/>
-        </w:rPr>
-        <w:t xml:space="preserve">does not change</w:t>
-      </w:r>
-      <w:r>
-        <w:t xml:space="preserve">, R only warns, and the script continues.</w:t>
-      </w:r>
-      <w:r>
-        <w:t xml:space="preserve"> </w:t>
-      </w:r>
-      <w:r>
-        <w:t xml:space="preserve">Everything it saves then goes into the</w:t>
-      </w:r>
-      <w:r>
-        <w:t xml:space="preserve"> </w:t>
-      </w:r>
-      <w:r>
-        <w:rPr>
-          <w:i/>
-          <w:iCs/>
-        </w:rPr>
-        <w:t xml:space="preserve">previous</w:t>
-      </w:r>
-      <w:r>
-        <w:t xml:space="preserve"> </w:t>
-      </w:r>
-      <w:r>
-        <w:t xml:space="preserve">folder, so your results</w:t>
-      </w:r>
-      <w:r>
-        <w:t xml:space="preserve"> </w:t>
-      </w:r>
-      <w:r>
-        <w:t xml:space="preserve">seem to disappear. In</w:t>
-      </w:r>
-      <w:r>
-        <w:t xml:space="preserve"> </w:t>
-      </w:r>
-      <w:r>
-        <w:rPr>
-          <w:rStyle w:val="VerbatimChar"/>
-        </w:rPr>
-        <w:t xml:space="preserve">Rscript</w:t>
-      </w:r>
-      <w:r>
-        <w:t xml:space="preserve"> </w:t>
-      </w:r>
-      <w:r>
-        <w:t xml:space="preserve">or in parallel workers the same mistake</w:t>
-      </w:r>
-      <w:r>
-        <w:t xml:space="preserve"> </w:t>
-      </w:r>
-      <w:r>
-        <w:t xml:space="preserve">stops the script at once.</w:t>
-      </w:r>
-    </w:p>
-    <w:p>
-      <w:pPr>
-        <w:pStyle w:val="BodyText"/>
-      </w:pPr>
-      <w:r>
-        <w:rPr>
-          <w:b/>
-          <w:bCs/>
         </w:rPr>
         <w:t xml:space="preserve">What you can do</w:t>
       </w:r>
     </w:p>
     <w:p>
       <w:pPr>
-        <w:pStyle w:val="Compact"/>
         <w:numPr>
           <w:ilvl w:val="0"/>
           <w:numId w:val="1010"/>
         </w:numPr>
+        <w:pStyle w:val="Compact"/>
       </w:pPr>
       <w:r>
         <w:t xml:space="preserve">Read the warning: it shows the folder you asked for and the one you are in</w:t>
@@ -3979,11 +4005,11 @@
     </w:p>
     <w:p>
       <w:pPr>
-        <w:pStyle w:val="Compact"/>
         <w:numPr>
           <w:ilvl w:val="0"/>
           <w:numId w:val="1010"/>
         </w:numPr>
+        <w:pStyle w:val="Compact"/>
       </w:pPr>
       <w:r>
         <w:t xml:space="preserve">Fix the path and run</w:t>
@@ -4006,11 +4032,11 @@
     </w:p>
     <w:p>
       <w:pPr>
-        <w:pStyle w:val="Compact"/>
         <w:numPr>
           <w:ilvl w:val="0"/>
           <w:numId w:val="1010"/>
         </w:numPr>
+        <w:pStyle w:val="Compact"/>
       </w:pPr>
       <w:r>
         <w:t xml:space="preserve">Better: avoid</w:t>
@@ -4060,11 +4086,11 @@
     </w:p>
     <w:p>
       <w:pPr>
-        <w:pStyle w:val="Compact"/>
         <w:numPr>
           <w:ilvl w:val="0"/>
           <w:numId w:val="1010"/>
         </w:numPr>
+        <w:pStyle w:val="Compact"/>
       </w:pPr>
       <w:r>
         <w:t xml:space="preserve">Lost files are usually in the folder shown after</w:t>
@@ -4088,8 +4114,8 @@
       </w:pPr>
       <w:r>
         <w:rPr>
+          <w:bCs/>
           <w:b/>
-          <w:bCs/>
         </w:rPr>
         <w:t xml:space="preserve">When to ask the admins</w:t>
       </w:r>
@@ -4170,10 +4196,64 @@
       </w:pPr>
       <w:r>
         <w:rPr>
+          <w:bCs/>
           <w:b/>
+        </w:rPr>
+        <w:t xml:space="preserve">What you see</w:t>
+      </w:r>
+    </w:p>
+    <w:p>
+      <w:pPr>
+        <w:pStyle w:val="BodyText"/>
+      </w:pPr>
+      <w:r>
+        <w:rPr>
+          <w:rStyle w:val="VerbatimChar"/>
+        </w:rPr>
+        <w:t xml:space="preserve">plot(1, 1)</w:t>
+      </w:r>
+      <w:r>
+        <w:t xml:space="preserve"> </w:t>
+      </w:r>
+      <w:r>
+        <w:t xml:space="preserve">or</w:t>
+      </w:r>
+      <w:r>
+        <w:t xml:space="preserve"> </w:t>
+      </w:r>
+      <w:r>
+        <w:rPr>
+          <w:rStyle w:val="VerbatimChar"/>
+        </w:rPr>
+        <w:t xml:space="preserve">print(my_ggplot)</w:t>
+      </w:r>
+      <w:r>
+        <w:t xml:space="preserve"> </w:t>
+      </w:r>
+      <w:r>
+        <w:t xml:space="preserve">gives no error, but nothing appears in</w:t>
+      </w:r>
+      <w:r>
+        <w:t xml:space="preserve"> </w:t>
+      </w:r>
+      <w:r>
+        <w:t xml:space="preserve">the</w:t>
+      </w:r>
+      <w:r>
+        <w:t xml:space="preserve"> </w:t>
+      </w:r>
+      <w:r>
+        <w:rPr>
           <w:bCs/>
-        </w:rPr>
-        <w:t xml:space="preserve">What you see</w:t>
+          <w:b/>
+        </w:rPr>
+        <w:t xml:space="preserve">Plots</w:t>
+      </w:r>
+      <w:r>
+        <w:t xml:space="preserve"> </w:t>
+      </w:r>
+      <w:r>
+        <w:t xml:space="preserve">pane.</w:t>
       </w:r>
     </w:p>
     <w:p>
@@ -4182,62 +4262,8 @@
       </w:pPr>
       <w:r>
         <w:rPr>
-          <w:rStyle w:val="VerbatimChar"/>
-        </w:rPr>
-        <w:t xml:space="preserve">plot(1, 1)</w:t>
-      </w:r>
-      <w:r>
-        <w:t xml:space="preserve"> </w:t>
-      </w:r>
-      <w:r>
-        <w:t xml:space="preserve">or</w:t>
-      </w:r>
-      <w:r>
-        <w:t xml:space="preserve"> </w:t>
-      </w:r>
-      <w:r>
-        <w:rPr>
-          <w:rStyle w:val="VerbatimChar"/>
-        </w:rPr>
-        <w:t xml:space="preserve">print(my_ggplot)</w:t>
-      </w:r>
-      <w:r>
-        <w:t xml:space="preserve"> </w:t>
-      </w:r>
-      <w:r>
-        <w:t xml:space="preserve">gives no error, but nothing appears in</w:t>
-      </w:r>
-      <w:r>
-        <w:t xml:space="preserve"> </w:t>
-      </w:r>
-      <w:r>
-        <w:t xml:space="preserve">the</w:t>
-      </w:r>
-      <w:r>
-        <w:t xml:space="preserve"> </w:t>
-      </w:r>
-      <w:r>
-        <w:rPr>
+          <w:bCs/>
           <w:b/>
-          <w:bCs/>
-        </w:rPr>
-        <w:t xml:space="preserve">Plots</w:t>
-      </w:r>
-      <w:r>
-        <w:t xml:space="preserve"> </w:t>
-      </w:r>
-      <w:r>
-        <w:t xml:space="preserve">pane.</w:t>
-      </w:r>
-    </w:p>
-    <w:p>
-      <w:pPr>
-        <w:pStyle w:val="BodyText"/>
-      </w:pPr>
-      <w:r>
-        <w:rPr>
-          <w:b/>
-          <w:bCs/>
         </w:rPr>
         <w:t xml:space="preserve">What you can do</w:t>
       </w:r>
@@ -4278,11 +4304,11 @@
     </w:p>
     <w:p>
       <w:pPr>
-        <w:pStyle w:val="SourceCode"/>
         <w:numPr>
           <w:ilvl w:val="0"/>
           <w:numId w:val="1000"/>
         </w:numPr>
+        <w:pStyle w:val="SourceCode"/>
       </w:pPr>
       <w:r>
         <w:rPr>
@@ -4377,8 +4403,8 @@
       </w:pPr>
       <w:r>
         <w:rPr>
+          <w:bCs/>
           <w:b/>
-          <w:bCs/>
         </w:rPr>
         <w:t xml:space="preserve">When to ask the admins</w:t>
       </w:r>
@@ -4468,10 +4494,57 @@
       </w:pPr>
       <w:r>
         <w:rPr>
+          <w:bCs/>
           <w:b/>
+        </w:rPr>
+        <w:t xml:space="preserve">What you see</w:t>
+      </w:r>
+    </w:p>
+    <w:p>
+      <w:pPr>
+        <w:pStyle w:val="BodyText"/>
+      </w:pPr>
+      <w:r>
+        <w:t xml:space="preserve">Reading or writing many files in your home folder (</w:t>
+      </w:r>
+      <w:r>
+        <w:rPr>
+          <w:rStyle w:val="VerbatimChar"/>
+        </w:rPr>
+        <w:t xml:space="preserve">~</w:t>
+      </w:r>
+      <w:r>
+        <w:t xml:space="preserve">) is much slower than</w:t>
+      </w:r>
+      <w:r>
+        <w:t xml:space="preserve"> </w:t>
+      </w:r>
+      <w:r>
+        <w:t xml:space="preserve">in</w:t>
+      </w:r>
+      <w:r>
+        <w:t xml:space="preserve"> </w:t>
+      </w:r>
+      <w:r>
+        <w:rPr>
+          <w:rStyle w:val="VerbatimChar"/>
+        </w:rPr>
+        <w:t xml:space="preserve">tempdir()</w:t>
+      </w:r>
+      <w:r>
+        <w:t xml:space="preserve">. A large raster in your home loads slowly.</w:t>
+      </w:r>
+    </w:p>
+    <w:p>
+      <w:pPr>
+        <w:pStyle w:val="BodyText"/>
+      </w:pPr>
+      <w:r>
+        <w:rPr>
           <w:bCs/>
-        </w:rPr>
-        <w:t xml:space="preserve">What you see</w:t>
+          <w:b/>
+        </w:rPr>
+        <w:t xml:space="preserve">Why it happens</w:t>
       </w:r>
     </w:p>
     <w:p>
@@ -4479,22 +4552,28 @@
         <w:pStyle w:val="BodyText"/>
       </w:pPr>
       <w:r>
-        <w:t xml:space="preserve">Reading or writing many files in your home folder (</w:t>
-      </w:r>
-      <w:r>
-        <w:rPr>
-          <w:rStyle w:val="VerbatimChar"/>
-        </w:rPr>
-        <w:t xml:space="preserve">~</w:t>
-      </w:r>
-      <w:r>
-        <w:t xml:space="preserve">) is much slower than</w:t>
-      </w:r>
-      <w:r>
-        <w:t xml:space="preserve"> </w:t>
-      </w:r>
-      <w:r>
-        <w:t xml:space="preserve">in</w:t>
+        <w:t xml:space="preserve">Your home folder is on network storage shared by all servers, so each read</w:t>
+      </w:r>
+      <w:r>
+        <w:t xml:space="preserve"> </w:t>
+      </w:r>
+      <w:r>
+        <w:t xml:space="preserve">goes over the network. The scratch disk</w:t>
+      </w:r>
+      <w:r>
+        <w:t xml:space="preserve"> </w:t>
+      </w:r>
+      <w:r>
+        <w:rPr>
+          <w:rStyle w:val="VerbatimChar"/>
+        </w:rPr>
+        <w:t xml:space="preserve">/Rtmp</w:t>
+      </w:r>
+      <w:r>
+        <w:t xml:space="preserve"> </w:t>
+      </w:r>
+      <w:r>
+        <w:t xml:space="preserve">(where</w:t>
       </w:r>
       <w:r>
         <w:t xml:space="preserve"> </w:t>
@@ -4506,7 +4585,16 @@
         <w:t xml:space="preserve">tempdir()</w:t>
       </w:r>
       <w:r>
-        <w:t xml:space="preserve">. A large raster in your home loads slowly.</w:t>
+        <w:t xml:space="preserve"> </w:t>
+      </w:r>
+      <w:r>
+        <w:t xml:space="preserve">points)</w:t>
+      </w:r>
+      <w:r>
+        <w:t xml:space="preserve"> </w:t>
+      </w:r>
+      <w:r>
+        <w:t xml:space="preserve">is a fast local disk inside each server.</w:t>
       </w:r>
     </w:p>
     <w:p>
@@ -4515,70 +4603,8 @@
       </w:pPr>
       <w:r>
         <w:rPr>
+          <w:bCs/>
           <w:b/>
-          <w:bCs/>
-        </w:rPr>
-        <w:t xml:space="preserve">Why it happens</w:t>
-      </w:r>
-    </w:p>
-    <w:p>
-      <w:pPr>
-        <w:pStyle w:val="BodyText"/>
-      </w:pPr>
-      <w:r>
-        <w:t xml:space="preserve">Your home folder is on network storage shared by all servers, so each read</w:t>
-      </w:r>
-      <w:r>
-        <w:t xml:space="preserve"> </w:t>
-      </w:r>
-      <w:r>
-        <w:t xml:space="preserve">goes over the network. The scratch disk</w:t>
-      </w:r>
-      <w:r>
-        <w:t xml:space="preserve"> </w:t>
-      </w:r>
-      <w:r>
-        <w:rPr>
-          <w:rStyle w:val="VerbatimChar"/>
-        </w:rPr>
-        <w:t xml:space="preserve">/Rtmp</w:t>
-      </w:r>
-      <w:r>
-        <w:t xml:space="preserve"> </w:t>
-      </w:r>
-      <w:r>
-        <w:t xml:space="preserve">(where</w:t>
-      </w:r>
-      <w:r>
-        <w:t xml:space="preserve"> </w:t>
-      </w:r>
-      <w:r>
-        <w:rPr>
-          <w:rStyle w:val="VerbatimChar"/>
-        </w:rPr>
-        <w:t xml:space="preserve">tempdir()</w:t>
-      </w:r>
-      <w:r>
-        <w:t xml:space="preserve"> </w:t>
-      </w:r>
-      <w:r>
-        <w:t xml:space="preserve">points)</w:t>
-      </w:r>
-      <w:r>
-        <w:t xml:space="preserve"> </w:t>
-      </w:r>
-      <w:r>
-        <w:t xml:space="preserve">is a fast local disk inside each server.</w:t>
-      </w:r>
-    </w:p>
-    <w:p>
-      <w:pPr>
-        <w:pStyle w:val="BodyText"/>
-      </w:pPr>
-      <w:r>
-        <w:rPr>
-          <w:b/>
-          <w:bCs/>
         </w:rPr>
         <w:t xml:space="preserve">What you can do</w:t>
       </w:r>
@@ -4651,11 +4677,11 @@
     </w:p>
     <w:p>
       <w:pPr>
-        <w:pStyle w:val="SourceCode"/>
         <w:numPr>
           <w:ilvl w:val="0"/>
           <w:numId w:val="1000"/>
         </w:numPr>
+        <w:pStyle w:val="SourceCode"/>
       </w:pPr>
       <w:r>
         <w:rPr>
@@ -4792,8 +4818,8 @@
       </w:pPr>
       <w:r>
         <w:rPr>
+          <w:bCs/>
           <w:b/>
-          <w:bCs/>
         </w:rPr>
         <w:t xml:space="preserve">When to ask the admins</w:t>
       </w:r>
@@ -4850,10 +4876,57 @@
       </w:pPr>
       <w:r>
         <w:rPr>
+          <w:bCs/>
           <w:b/>
+        </w:rPr>
+        <w:t xml:space="preserve">What you see</w:t>
+      </w:r>
+    </w:p>
+    <w:p>
+      <w:pPr>
+        <w:pStyle w:val="BodyText"/>
+      </w:pPr>
+      <w:r>
+        <w:t xml:space="preserve">Files you wrote to</w:t>
+      </w:r>
+      <w:r>
+        <w:t xml:space="preserve"> </w:t>
+      </w:r>
+      <w:r>
+        <w:rPr>
+          <w:rStyle w:val="VerbatimChar"/>
+        </w:rPr>
+        <w:t xml:space="preserve">/Rtmp</w:t>
+      </w:r>
+      <w:r>
+        <w:t xml:space="preserve"> </w:t>
+      </w:r>
+      <w:r>
+        <w:t xml:space="preserve">(or</w:t>
+      </w:r>
+      <w:r>
+        <w:t xml:space="preserve"> </w:t>
+      </w:r>
+      <w:r>
+        <w:rPr>
+          <w:rStyle w:val="VerbatimChar"/>
+        </w:rPr>
+        <w:t xml:space="preserve">tempdir()</w:t>
+      </w:r>
+      <w:r>
+        <w:t xml:space="preserve">) a few days ago are gone.</w:t>
+      </w:r>
+    </w:p>
+    <w:p>
+      <w:pPr>
+        <w:pStyle w:val="BodyText"/>
+      </w:pPr>
+      <w:r>
+        <w:rPr>
           <w:bCs/>
-        </w:rPr>
-        <w:t xml:space="preserve">What you see</w:t>
+          <w:b/>
+        </w:rPr>
+        <w:t xml:space="preserve">Why it happens</w:t>
       </w:r>
     </w:p>
     <w:p>
@@ -4861,12 +4934,6 @@
         <w:pStyle w:val="BodyText"/>
       </w:pPr>
       <w:r>
-        <w:t xml:space="preserve">Files you wrote to</w:t>
-      </w:r>
-      <w:r>
-        <w:t xml:space="preserve"> </w:t>
-      </w:r>
-      <w:r>
         <w:rPr>
           <w:rStyle w:val="VerbatimChar"/>
         </w:rPr>
@@ -4876,19 +4943,43 @@
         <w:t xml:space="preserve"> </w:t>
       </w:r>
       <w:r>
-        <w:t xml:space="preserve">(or</w:t>
-      </w:r>
-      <w:r>
-        <w:t xml:space="preserve"> </w:t>
-      </w:r>
-      <w:r>
-        <w:rPr>
-          <w:rStyle w:val="VerbatimChar"/>
-        </w:rPr>
-        <w:t xml:space="preserve">tempdir()</w:t>
-      </w:r>
-      <w:r>
-        <w:t xml:space="preserve">) a few days ago are gone.</w:t>
+        <w:t xml:space="preserve">is scratch space. Old files are deleted automatically after the</w:t>
+      </w:r>
+      <w:r>
+        <w:t xml:space="preserve"> </w:t>
+      </w:r>
+      <w:r>
+        <w:t xml:space="preserve">period shown by</w:t>
+      </w:r>
+      <w:r>
+        <w:t xml:space="preserve"> </w:t>
+      </w:r>
+      <w:r>
+        <w:rPr>
+          <w:rStyle w:val="VerbatimChar"/>
+        </w:rPr>
+        <w:t xml:space="preserve">status()</w:t>
+      </w:r>
+      <w:r>
+        <w:t xml:space="preserve"> </w:t>
+      </w:r>
+      <w:r>
+        <w:t xml:space="preserve">(</w:t>
+      </w:r>
+      <w:r>
+        <w:rPr>
+          <w:rStyle w:val="VerbatimChar"/>
+        </w:rPr>
+        <w:t xml:space="preserve">Tmp Cleanup: Files &gt;N hours</w:t>
+      </w:r>
+      <w:r>
+        <w:t xml:space="preserve">, about 48 hours).</w:t>
+      </w:r>
+      <w:r>
+        <w:t xml:space="preserve"> </w:t>
+      </w:r>
+      <w:r>
+        <w:t xml:space="preserve">It is local to each server and has no backup.</w:t>
       </w:r>
     </w:p>
     <w:p>
@@ -4897,84 +4988,19 @@
       </w:pPr>
       <w:r>
         <w:rPr>
+          <w:bCs/>
           <w:b/>
-          <w:bCs/>
-        </w:rPr>
-        <w:t xml:space="preserve">Why it happens</w:t>
-      </w:r>
-    </w:p>
-    <w:p>
-      <w:pPr>
-        <w:pStyle w:val="BodyText"/>
-      </w:pPr>
-      <w:r>
-        <w:rPr>
-          <w:rStyle w:val="VerbatimChar"/>
-        </w:rPr>
-        <w:t xml:space="preserve">/Rtmp</w:t>
-      </w:r>
-      <w:r>
-        <w:t xml:space="preserve"> </w:t>
-      </w:r>
-      <w:r>
-        <w:t xml:space="preserve">is scratch space. Old files are deleted automatically after the</w:t>
-      </w:r>
-      <w:r>
-        <w:t xml:space="preserve"> </w:t>
-      </w:r>
-      <w:r>
-        <w:t xml:space="preserve">period shown by</w:t>
-      </w:r>
-      <w:r>
-        <w:t xml:space="preserve"> </w:t>
-      </w:r>
-      <w:r>
-        <w:rPr>
-          <w:rStyle w:val="VerbatimChar"/>
-        </w:rPr>
-        <w:t xml:space="preserve">status()</w:t>
-      </w:r>
-      <w:r>
-        <w:t xml:space="preserve"> </w:t>
-      </w:r>
-      <w:r>
-        <w:t xml:space="preserve">(</w:t>
-      </w:r>
-      <w:r>
-        <w:rPr>
-          <w:rStyle w:val="VerbatimChar"/>
-        </w:rPr>
-        <w:t xml:space="preserve">Tmp Cleanup: Files &gt;N hours</w:t>
-      </w:r>
-      <w:r>
-        <w:t xml:space="preserve">, about 48 hours).</w:t>
-      </w:r>
-      <w:r>
-        <w:t xml:space="preserve"> </w:t>
-      </w:r>
-      <w:r>
-        <w:t xml:space="preserve">It is local to each server and has no backup.</w:t>
-      </w:r>
-    </w:p>
-    <w:p>
-      <w:pPr>
-        <w:pStyle w:val="BodyText"/>
-      </w:pPr>
-      <w:r>
-        <w:rPr>
-          <w:b/>
-          <w:bCs/>
         </w:rPr>
         <w:t xml:space="preserve">What you can do</w:t>
       </w:r>
     </w:p>
     <w:p>
       <w:pPr>
-        <w:pStyle w:val="Compact"/>
         <w:numPr>
           <w:ilvl w:val="0"/>
           <w:numId w:val="1013"/>
         </w:numPr>
+        <w:pStyle w:val="Compact"/>
       </w:pPr>
       <w:r>
         <w:t xml:space="preserve">Treat</w:t>
@@ -5003,11 +5029,11 @@
     </w:p>
     <w:p>
       <w:pPr>
-        <w:pStyle w:val="Compact"/>
         <w:numPr>
           <w:ilvl w:val="0"/>
           <w:numId w:val="1013"/>
         </w:numPr>
+        <w:pStyle w:val="Compact"/>
       </w:pPr>
       <w:r>
         <w:t xml:space="preserve">Files you need for longer belong in your home (mind the quota, section 1)</w:t>
@@ -5042,19 +5068,19 @@
       </w:pPr>
       <w:r>
         <w:rPr>
+          <w:bCs/>
           <w:b/>
-          <w:bCs/>
         </w:rPr>
         <w:t xml:space="preserve">What you see</w:t>
       </w:r>
     </w:p>
     <w:p>
       <w:pPr>
-        <w:pStyle w:val="Compact"/>
         <w:numPr>
           <w:ilvl w:val="0"/>
           <w:numId w:val="1014"/>
         </w:numPr>
+        <w:pStyle w:val="Compact"/>
       </w:pPr>
       <w:r>
         <w:t xml:space="preserve">The login page rejects your university credentials, or shows an error.</w:t>
@@ -5062,11 +5088,11 @@
     </w:p>
     <w:p>
       <w:pPr>
-        <w:pStyle w:val="Compact"/>
         <w:numPr>
           <w:ilvl w:val="0"/>
           <w:numId w:val="1014"/>
         </w:numPr>
+        <w:pStyle w:val="Compact"/>
       </w:pPr>
       <w:r>
         <w:t xml:space="preserve">RStudio opens but the session never finishes starting, or you get a new</w:t>
@@ -5080,23 +5106,41 @@
     </w:p>
     <w:p>
       <w:pPr>
+        <w:numPr>
+          <w:ilvl w:val="0"/>
+          <w:numId w:val="1014"/>
+        </w:numPr>
+        <w:pStyle w:val="Compact"/>
+      </w:pPr>
+      <w:r>
+        <w:t xml:space="preserve">RStudio stays on "Loading…" for minutes, and pressing Terminate or</w:t>
+      </w:r>
+      <w:r>
+        <w:t xml:space="preserve"> </w:t>
+      </w:r>
+      <w:r>
+        <w:t xml:space="preserve">reloading the page only starts the wait again.</w:t>
+      </w:r>
+    </w:p>
+    <w:p>
+      <w:pPr>
         <w:pStyle w:val="FirstParagraph"/>
       </w:pPr>
       <w:r>
         <w:rPr>
+          <w:bCs/>
           <w:b/>
-          <w:bCs/>
         </w:rPr>
         <w:t xml:space="preserve">Why it happens</w:t>
       </w:r>
     </w:p>
     <w:p>
       <w:pPr>
-        <w:pStyle w:val="Compact"/>
         <w:numPr>
           <w:ilvl w:val="0"/>
           <w:numId w:val="1015"/>
         </w:numPr>
+        <w:pStyle w:val="Compact"/>
       </w:pPr>
       <w:r>
         <w:t xml:space="preserve">You log in with your university (Active Directory) username and</w:t>
@@ -5116,11 +5160,11 @@
     </w:p>
     <w:p>
       <w:pPr>
-        <w:pStyle w:val="Compact"/>
         <w:numPr>
           <w:ilvl w:val="0"/>
           <w:numId w:val="1015"/>
         </w:numPr>
+        <w:pStyle w:val="Compact"/>
       </w:pPr>
       <w:r>
         <w:t xml:space="preserve">Your previous R session is kept for about 48 hours after you close the</w:t>
@@ -5134,12 +5178,36 @@
     </w:p>
     <w:p>
       <w:pPr>
+        <w:numPr>
+          <w:ilvl w:val="0"/>
+          <w:numId w:val="1015"/>
+        </w:numPr>
+        <w:pStyle w:val="Compact"/>
+      </w:pPr>
+      <w:r>
+        <w:t xml:space="preserve">When the server is restarted, or your session has been idle for a long</w:t>
+      </w:r>
+      <w:r>
+        <w:t xml:space="preserve"> </w:t>
+      </w:r>
+      <w:r>
+        <w:t xml:space="preserve">time, RStudio saves everything in your Environment to disk and loads it</w:t>
+      </w:r>
+      <w:r>
+        <w:t xml:space="preserve"> </w:t>
+      </w:r>
+      <w:r>
+        <w:t xml:space="preserve">back when you return. With several GB of objects this takes minutes.</w:t>
+      </w:r>
+    </w:p>
+    <w:p>
+      <w:pPr>
         <w:pStyle w:val="FirstParagraph"/>
       </w:pPr>
       <w:r>
         <w:rPr>
+          <w:bCs/>
           <w:b/>
-          <w:bCs/>
         </w:rPr>
         <w:t xml:space="preserve">What you can do</w:t>
       </w:r>
@@ -5163,7 +5231,32 @@
         </w:numPr>
       </w:pPr>
       <w:r>
-        <w:t xml:space="preserve">Try a private/incognito browser window (old cookies can break the login).</w:t>
+        <w:t xml:space="preserve">If it stays on "Loading…": close every RStudio tab, open</w:t>
+      </w:r>
+      <w:r>
+        <w:t xml:space="preserve"> </w:t>
+      </w:r>
+      <w:r>
+        <w:rPr>
+          <w:bCs/>
+          <w:b/>
+        </w:rPr>
+        <w:t xml:space="preserve">one</w:t>
+      </w:r>
+      <w:r>
+        <w:t xml:space="preserve">, and</w:t>
+      </w:r>
+      <w:r>
+        <w:t xml:space="preserve"> </w:t>
+      </w:r>
+      <w:r>
+        <w:t xml:space="preserve">wait 3 minutes without pressing Terminate or reloading. Two tabs at once</w:t>
+      </w:r>
+      <w:r>
+        <w:t xml:space="preserve"> </w:t>
+      </w:r>
+      <w:r>
+        <w:t xml:space="preserve">make the problem worse.</w:t>
       </w:r>
     </w:p>
     <w:p>
@@ -5174,6 +5267,64 @@
         </w:numPr>
       </w:pPr>
       <w:r>
+        <w:t xml:space="preserve">Keep big objects in files, not only in the Environment: save them with</w:t>
+      </w:r>
+      <w:r>
+        <w:t xml:space="preserve"> </w:t>
+      </w:r>
+      <w:r>
+        <w:rPr>
+          <w:rStyle w:val="VerbatimChar"/>
+        </w:rPr>
+        <w:t xml:space="preserve">saveRDS()</w:t>
+      </w:r>
+      <w:r>
+        <w:t xml:space="preserve"> </w:t>
+      </w:r>
+      <w:r>
+        <w:t xml:space="preserve">in your project folder and remove them with</w:t>
+      </w:r>
+      <w:r>
+        <w:t xml:space="preserve"> </w:t>
+      </w:r>
+      <w:r>
+        <w:rPr>
+          <w:rStyle w:val="VerbatimChar"/>
+        </w:rPr>
+        <w:t xml:space="preserve">rm()</w:t>
+      </w:r>
+      <w:r>
+        <w:t xml:space="preserve"> </w:t>
+      </w:r>
+      <w:r>
+        <w:t xml:space="preserve">when you</w:t>
+      </w:r>
+      <w:r>
+        <w:t xml:space="preserve"> </w:t>
+      </w:r>
+      <w:r>
+        <w:t xml:space="preserve">stop working. Your next login will then be fast.</w:t>
+      </w:r>
+    </w:p>
+    <w:p>
+      <w:pPr>
+        <w:numPr>
+          <w:ilvl w:val="0"/>
+          <w:numId w:val="1016"/>
+        </w:numPr>
+      </w:pPr>
+      <w:r>
+        <w:t xml:space="preserve">Try a private/incognito browser window (old cookies can break the login).</w:t>
+      </w:r>
+    </w:p>
+    <w:p>
+      <w:pPr>
+        <w:numPr>
+          <w:ilvl w:val="0"/>
+          <w:numId w:val="1016"/>
+        </w:numPr>
+      </w:pPr>
+      <w:r>
         <w:t xml:space="preserve">If R starts but behaves strangely, open the portal's</w:t>
       </w:r>
       <w:r>
@@ -5181,8 +5332,8 @@
       </w:r>
       <w:r>
         <w:rPr>
+          <w:bCs/>
           <w:b/>
-          <w:bCs/>
         </w:rPr>
         <w:t xml:space="preserve">Terminal</w:t>
       </w:r>
@@ -5201,11 +5352,11 @@
     </w:p>
     <w:p>
       <w:pPr>
-        <w:pStyle w:val="SourceCode"/>
         <w:numPr>
           <w:ilvl w:val="0"/>
           <w:numId w:val="1000"/>
         </w:numPr>
+        <w:pStyle w:val="SourceCode"/>
       </w:pPr>
       <w:r>
         <w:rPr>
@@ -5249,8 +5400,8 @@
       </w:pPr>
       <w:r>
         <w:rPr>
+          <w:bCs/>
           <w:b/>
-          <w:bCs/>
         </w:rPr>
         <w:t xml:space="preserve">When to ask the admins</w:t>
       </w:r>
@@ -5298,10 +5449,36 @@
       </w:pPr>
       <w:r>
         <w:rPr>
+          <w:bCs/>
           <w:b/>
+        </w:rPr>
+        <w:t xml:space="preserve">What you see</w:t>
+      </w:r>
+    </w:p>
+    <w:p>
+      <w:pPr>
+        <w:pStyle w:val="BodyText"/>
+      </w:pPr>
+      <w:r>
+        <w:t xml:space="preserve">You left a 10-hour script running in the console, closed the laptop, and</w:t>
+      </w:r>
+      <w:r>
+        <w:t xml:space="preserve"> </w:t>
+      </w:r>
+      <w:r>
+        <w:t xml:space="preserve">the next morning the session was gone.</w:t>
+      </w:r>
+    </w:p>
+    <w:p>
+      <w:pPr>
+        <w:pStyle w:val="BodyText"/>
+      </w:pPr>
+      <w:r>
+        <w:rPr>
           <w:bCs/>
-        </w:rPr>
-        <w:t xml:space="preserve">What you see</w:t>
+          <w:b/>
+        </w:rPr>
+        <w:t xml:space="preserve">Why it happens</w:t>
       </w:r>
     </w:p>
     <w:p>
@@ -5309,13 +5486,19 @@
         <w:pStyle w:val="BodyText"/>
       </w:pPr>
       <w:r>
-        <w:t xml:space="preserve">You left a 10-hour script running in the console, closed the laptop, and</w:t>
-      </w:r>
-      <w:r>
-        <w:t xml:space="preserve"> </w:t>
-      </w:r>
-      <w:r>
-        <w:t xml:space="preserve">the next morning the session was gone.</w:t>
+        <w:t xml:space="preserve">The session waits for you about 48 hours, but a browser crash or running</w:t>
+      </w:r>
+      <w:r>
+        <w:t xml:space="preserve"> </w:t>
+      </w:r>
+      <w:r>
+        <w:t xml:space="preserve">out of memory still loses everything that was not saved to disk. The</w:t>
+      </w:r>
+      <w:r>
+        <w:t xml:space="preserve"> </w:t>
+      </w:r>
+      <w:r>
+        <w:t xml:space="preserve">console is the wrong place for long runs.</w:t>
       </w:r>
     </w:p>
     <w:p>
@@ -5324,40 +5507,8 @@
       </w:pPr>
       <w:r>
         <w:rPr>
+          <w:bCs/>
           <w:b/>
-          <w:bCs/>
-        </w:rPr>
-        <w:t xml:space="preserve">Why it happens</w:t>
-      </w:r>
-    </w:p>
-    <w:p>
-      <w:pPr>
-        <w:pStyle w:val="BodyText"/>
-      </w:pPr>
-      <w:r>
-        <w:t xml:space="preserve">The session waits for you about 48 hours, but a browser crash or running</w:t>
-      </w:r>
-      <w:r>
-        <w:t xml:space="preserve"> </w:t>
-      </w:r>
-      <w:r>
-        <w:t xml:space="preserve">out of memory still loses everything that was not saved to disk. The</w:t>
-      </w:r>
-      <w:r>
-        <w:t xml:space="preserve"> </w:t>
-      </w:r>
-      <w:r>
-        <w:t xml:space="preserve">console is the wrong place for long runs.</w:t>
-      </w:r>
-    </w:p>
-    <w:p>
-      <w:pPr>
-        <w:pStyle w:val="BodyText"/>
-      </w:pPr>
-      <w:r>
-        <w:rPr>
-          <w:b/>
-          <w:bCs/>
         </w:rPr>
         <w:t xml:space="preserve">What you can do</w:t>
       </w:r>
@@ -5371,24 +5522,24 @@
       </w:pPr>
       <w:r>
         <w:rPr>
+          <w:bCs/>
           <w:b/>
+        </w:rPr>
+        <w:t xml:space="preserve">RStudio Background Jobs</w:t>
+      </w:r>
+      <w:r>
+        <w:t xml:space="preserve"> </w:t>
+      </w:r>
+      <w:r>
+        <w:t xml:space="preserve">(easiest): the</w:t>
+      </w:r>
+      <w:r>
+        <w:t xml:space="preserve"> </w:t>
+      </w:r>
+      <w:r>
+        <w:rPr>
           <w:bCs/>
-        </w:rPr>
-        <w:t xml:space="preserve">RStudio Background Jobs</w:t>
-      </w:r>
-      <w:r>
-        <w:t xml:space="preserve"> </w:t>
-      </w:r>
-      <w:r>
-        <w:t xml:space="preserve">(easiest): the</w:t>
-      </w:r>
-      <w:r>
-        <w:t xml:space="preserve"> </w:t>
-      </w:r>
-      <w:r>
-        <w:rPr>
           <w:b/>
-          <w:bCs/>
         </w:rPr>
         <w:t xml:space="preserve">Background Jobs</w:t>
       </w:r>
@@ -5409,8 +5560,8 @@
       </w:r>
       <w:r>
         <w:rPr>
+          <w:iCs/>
           <w:i/>
-          <w:iCs/>
         </w:rPr>
         <w:t xml:space="preserve">Start Background Job</w:t>
       </w:r>
@@ -5436,8 +5587,8 @@
       </w:pPr>
       <w:r>
         <w:rPr>
+          <w:bCs/>
           <w:b/>
-          <w:bCs/>
         </w:rPr>
         <w:t xml:space="preserve">tmux</w:t>
       </w:r>
@@ -5462,11 +5613,11 @@
     </w:p>
     <w:p>
       <w:pPr>
-        <w:pStyle w:val="SourceCode"/>
         <w:numPr>
           <w:ilvl w:val="0"/>
           <w:numId w:val="1000"/>
         </w:numPr>
+        <w:pStyle w:val="SourceCode"/>
       </w:pPr>
       <w:r>
         <w:rPr>
@@ -5599,10 +5750,101 @@
       </w:pPr>
       <w:r>
         <w:rPr>
+          <w:bCs/>
           <w:b/>
+        </w:rPr>
+        <w:t xml:space="preserve">When to ask the admins</w:t>
+      </w:r>
+    </w:p>
+    <w:p>
+      <w:pPr>
+        <w:pStyle w:val="BodyText"/>
+      </w:pPr>
+      <w:r>
+        <w:t xml:space="preserve">If a background job or tmux run was stopped before finishing. Send the</w:t>
+      </w:r>
+      <w:r>
+        <w:t xml:space="preserve"> </w:t>
+      </w:r>
+      <w:r>
+        <w:t xml:space="preserve">script path, the start time, and</w:t>
+      </w:r>
+      <w:r>
+        <w:t xml:space="preserve"> </w:t>
+      </w:r>
+      <w:r>
+        <w:rPr>
+          <w:rStyle w:val="VerbatimChar"/>
+        </w:rPr>
+        <w:t xml:space="preserve">status()</w:t>
+      </w:r>
+      <w:r>
+        <w:t xml:space="preserve"> </w:t>
+      </w:r>
+      <w:r>
+        <w:t xml:space="preserve">from a new session.</w:t>
+      </w:r>
+    </w:p>
+    <w:bookmarkEnd w:id="33"/>
+    <w:bookmarkStart w:id="34" w:name="Xe4e48c1d24d015d8ff81e3dc14da343e4cd9228"/>
+    <w:p>
+      <w:pPr>
+        <w:pStyle w:val="Heading2"/>
+      </w:pPr>
+      <w:r>
+        <w:t xml:space="preserve">14. read.csv() returns an old version of a file you just saved</w:t>
+      </w:r>
+    </w:p>
+    <w:p>
+      <w:pPr>
+        <w:pStyle w:val="FirstParagraph"/>
+      </w:pPr>
+      <w:r>
+        <w:rPr>
           <w:bCs/>
-        </w:rPr>
-        <w:t xml:space="preserve">When to ask the admins</w:t>
+          <w:b/>
+        </w:rPr>
+        <w:t xml:space="preserve">What you see</w:t>
+      </w:r>
+    </w:p>
+    <w:p>
+      <w:pPr>
+        <w:pStyle w:val="SourceCode"/>
+      </w:pPr>
+      <w:r>
+        <w:rPr>
+          <w:rStyle w:val="VerbatimChar"/>
+        </w:rPr>
+        <w:t xml:space="preserve">BIOME-IO: Using .parquet accelerator (read.csv -&gt; arrow)</w:t>
+      </w:r>
+    </w:p>
+    <w:p>
+      <w:pPr>
+        <w:pStyle w:val="FirstParagraph"/>
+      </w:pPr>
+      <w:r>
+        <w:t xml:space="preserve">and the table has the old columns or values, even though</w:t>
+      </w:r>
+      <w:r>
+        <w:t xml:space="preserve"> </w:t>
+      </w:r>
+      <w:r>
+        <w:rPr>
+          <w:rStyle w:val="VerbatimChar"/>
+        </w:rPr>
+        <w:t xml:space="preserve">write.csv()</w:t>
+      </w:r>
+      <w:r>
+        <w:t xml:space="preserve"> </w:t>
+      </w:r>
+      <w:r>
+        <w:t xml:space="preserve">saved</w:t>
+      </w:r>
+      <w:r>
+        <w:t xml:space="preserve"> </w:t>
+      </w:r>
+      <w:r>
+        <w:t xml:space="preserve">the new ones.</w:t>
       </w:r>
     </w:p>
     <w:p>
@@ -5610,32 +5852,447 @@
         <w:pStyle w:val="BodyText"/>
       </w:pPr>
       <w:r>
-        <w:t xml:space="preserve">If a background job or tmux run was stopped before finishing. Send the</w:t>
-      </w:r>
-      <w:r>
-        <w:t xml:space="preserve"> </w:t>
-      </w:r>
-      <w:r>
-        <w:t xml:space="preserve">script path, the start time, and</w:t>
-      </w:r>
-      <w:r>
-        <w:t xml:space="preserve"> </w:t>
-      </w:r>
-      <w:r>
-        <w:rPr>
-          <w:rStyle w:val="VerbatimChar"/>
-        </w:rPr>
-        <w:t xml:space="preserve">status()</w:t>
-      </w:r>
-      <w:r>
-        <w:t xml:space="preserve"> </w:t>
-      </w:r>
-      <w:r>
-        <w:t xml:space="preserve">from a new session.</w:t>
-      </w:r>
-    </w:p>
-    <w:bookmarkEnd w:id="33"/>
+        <w:rPr>
+          <w:bCs/>
+          <w:b/>
+        </w:rPr>
+        <w:t xml:space="preserve">Why it happens</w:t>
+      </w:r>
+    </w:p>
+    <w:p>
+      <w:pPr>
+        <w:pStyle w:val="BodyText"/>
+      </w:pPr>
+      <w:r>
+        <w:t xml:space="preserve">If a file</w:t>
+      </w:r>
+      <w:r>
+        <w:t xml:space="preserve"> </w:t>
+      </w:r>
+      <w:r>
+        <w:rPr>
+          <w:rStyle w:val="VerbatimChar"/>
+        </w:rPr>
+        <w:t xml:space="preserve">data.csv.parquet</w:t>
+      </w:r>
+      <w:r>
+        <w:t xml:space="preserve"> </w:t>
+      </w:r>
+      <w:r>
+        <w:t xml:space="preserve">sits next to</w:t>
+      </w:r>
+      <w:r>
+        <w:t xml:space="preserve"> </w:t>
+      </w:r>
+      <w:r>
+        <w:rPr>
+          <w:rStyle w:val="VerbatimChar"/>
+        </w:rPr>
+        <w:t xml:space="preserve">data.csv</w:t>
+      </w:r>
+      <w:r>
+        <w:t xml:space="preserve">, the server reads the</w:t>
+      </w:r>
+      <w:r>
+        <w:t xml:space="preserve"> </w:t>
+      </w:r>
+      <w:r>
+        <w:t xml:space="preserve">faster parquet copy instead. Before October 2026 it did so even when the CSV</w:t>
+      </w:r>
+      <w:r>
+        <w:t xml:space="preserve"> </w:t>
+      </w:r>
+      <w:r>
+        <w:t xml:space="preserve">was newer, so you got the old copy back.</w:t>
+      </w:r>
+    </w:p>
+    <w:p>
+      <w:pPr>
+        <w:pStyle w:val="BodyText"/>
+      </w:pPr>
+      <w:r>
+        <w:rPr>
+          <w:bCs/>
+          <w:b/>
+        </w:rPr>
+        <w:t xml:space="preserve">What to do</w:t>
+      </w:r>
+    </w:p>
+    <w:p>
+      <w:pPr>
+        <w:numPr>
+          <w:ilvl w:val="0"/>
+          <w:numId w:val="1018"/>
+        </w:numPr>
+        <w:pStyle w:val="Compact"/>
+      </w:pPr>
+      <w:r>
+        <w:t xml:space="preserve">The server now ignores a parquet copy that is not newer than the CSV, and says</w:t>
+      </w:r>
+      <w:r>
+        <w:t xml:space="preserve"> </w:t>
+      </w:r>
+      <w:r>
+        <w:t xml:space="preserve">so with</w:t>
+      </w:r>
+      <w:r>
+        <w:t xml:space="preserve"> </w:t>
+      </w:r>
+      <w:r>
+        <w:rPr>
+          <w:rStyle w:val="VerbatimChar"/>
+        </w:rPr>
+        <w:t xml:space="preserve">BIOME-IO: ignoring stale parquet sidecar</w:t>
+      </w:r>
+      <w:r>
+        <w:t xml:space="preserve">.</w:t>
+      </w:r>
+    </w:p>
+    <w:p>
+      <w:pPr>
+        <w:numPr>
+          <w:ilvl w:val="0"/>
+          <w:numId w:val="1018"/>
+        </w:numPr>
+        <w:pStyle w:val="Compact"/>
+      </w:pPr>
+      <w:r>
+        <w:t xml:space="preserve">If you do not need the parquet copy, delete it:</w:t>
+      </w:r>
+      <w:r>
+        <w:t xml:space="preserve"> </w:t>
+      </w:r>
+      <w:r>
+        <w:rPr>
+          <w:rStyle w:val="VerbatimChar"/>
+        </w:rPr>
+        <w:t xml:space="preserve">file.remove("data.csv.parquet")</w:t>
+      </w:r>
+      <w:r>
+        <w:t xml:space="preserve">.</w:t>
+      </w:r>
+    </w:p>
+    <w:p>
+      <w:pPr>
+        <w:numPr>
+          <w:ilvl w:val="0"/>
+          <w:numId w:val="1018"/>
+        </w:numPr>
+        <w:pStyle w:val="Compact"/>
+      </w:pPr>
+      <w:r>
+        <w:t xml:space="preserve">To switch the feature off for your session:</w:t>
+      </w:r>
+      <w:r>
+        <w:t xml:space="preserve"> </w:t>
+      </w:r>
+      <w:r>
+        <w:rPr>
+          <w:rStyle w:val="VerbatimChar"/>
+        </w:rPr>
+        <w:t xml:space="preserve">options(biome.parquet_sidecar = FALSE)</w:t>
+      </w:r>
+      <w:r>
+        <w:t xml:space="preserve">.</w:t>
+      </w:r>
+    </w:p>
     <w:bookmarkEnd w:id="34"/>
+    <w:bookmarkStart w:id="35" w:name="X76ce21d761047ba943b0580984bbe196f7a144a"/>
+    <w:p>
+      <w:pPr>
+        <w:pStyle w:val="Heading2"/>
+      </w:pPr>
+      <w:r>
+        <w:t xml:space="preserve">15. ranger / mlr3: "User interrupt or internal error"</w:t>
+      </w:r>
+    </w:p>
+    <w:p>
+      <w:pPr>
+        <w:pStyle w:val="FirstParagraph"/>
+      </w:pPr>
+      <w:r>
+        <w:rPr>
+          <w:bCs/>
+          <w:b/>
+        </w:rPr>
+        <w:t xml:space="preserve">What you see</w:t>
+      </w:r>
+    </w:p>
+    <w:p>
+      <w:pPr>
+        <w:pStyle w:val="SourceCode"/>
+      </w:pPr>
+      <w:r>
+        <w:rPr>
+          <w:rStyle w:val="VerbatimChar"/>
+        </w:rPr>
+        <w:t xml:space="preserve">Warning: Caught simpleError. Canceling all iterations ...</w:t>
+      </w:r>
+      <w:r>
+        <w:br/>
+      </w:r>
+      <w:r>
+        <w:rPr>
+          <w:rStyle w:val="VerbatimChar"/>
+        </w:rPr>
+        <w:t xml:space="preserve">Error in ranger::ranger(...) : User interrupt or internal error.</w:t>
+      </w:r>
+    </w:p>
+    <w:p>
+      <w:pPr>
+        <w:pStyle w:val="FirstParagraph"/>
+      </w:pPr>
+      <w:r>
+        <w:rPr>
+          <w:bCs/>
+          <w:b/>
+        </w:rPr>
+        <w:t xml:space="preserve">Why it happens</w:t>
+      </w:r>
+    </w:p>
+    <w:p>
+      <w:pPr>
+        <w:pStyle w:val="BodyText"/>
+      </w:pPr>
+      <w:r>
+        <w:t xml:space="preserve">This is not an interrupt and not the server. ranger stops on a bad setting and</w:t>
+      </w:r>
+      <w:r>
+        <w:t xml:space="preserve"> </w:t>
+      </w:r>
+      <w:r>
+        <w:t xml:space="preserve">prints the real reason on the worker, where you do not see it. The most common</w:t>
+      </w:r>
+      <w:r>
+        <w:t xml:space="preserve"> </w:t>
+      </w:r>
+      <w:r>
+        <w:t xml:space="preserve">one is</w:t>
+      </w:r>
+      <w:r>
+        <w:t xml:space="preserve"> </w:t>
+      </w:r>
+      <w:r>
+        <w:rPr>
+          <w:rStyle w:val="VerbatimChar"/>
+        </w:rPr>
+        <w:t xml:space="preserve">mtry</w:t>
+      </w:r>
+      <w:r>
+        <w:t xml:space="preserve"> </w:t>
+      </w:r>
+      <w:r>
+        <w:t xml:space="preserve">larger than the number of predictors:</w:t>
+      </w:r>
+    </w:p>
+    <w:p>
+      <w:pPr>
+        <w:pStyle w:val="SourceCode"/>
+      </w:pPr>
+      <w:r>
+        <w:rPr>
+          <w:rStyle w:val="VerbatimChar"/>
+        </w:rPr>
+        <w:t xml:space="preserve">Error: mtry can not be larger than number of variables in data. Ranger will EXIT now.</w:t>
+      </w:r>
+    </w:p>
+    <w:p>
+      <w:pPr>
+        <w:pStyle w:val="FirstParagraph"/>
+      </w:pPr>
+      <w:r>
+        <w:t xml:space="preserve">With tuning (</w:t>
+      </w:r>
+      <w:r>
+        <w:rPr>
+          <w:rStyle w:val="VerbatimChar"/>
+        </w:rPr>
+        <w:t xml:space="preserve">mlr3tuning</w:t>
+      </w:r>
+      <w:r>
+        <w:t xml:space="preserve">,</w:t>
+      </w:r>
+      <w:r>
+        <w:t xml:space="preserve"> </w:t>
+      </w:r>
+      <w:r>
+        <w:rPr>
+          <w:rStyle w:val="VerbatimChar"/>
+        </w:rPr>
+        <w:t xml:space="preserve">AutoTuner</w:t>
+      </w:r>
+      <w:r>
+        <w:t xml:space="preserve">), this happens when the search space</w:t>
+      </w:r>
+      <w:r>
+        <w:t xml:space="preserve"> </w:t>
+      </w:r>
+      <w:r>
+        <w:t xml:space="preserve">for</w:t>
+      </w:r>
+      <w:r>
+        <w:t xml:space="preserve"> </w:t>
+      </w:r>
+      <w:r>
+        <w:rPr>
+          <w:rStyle w:val="VerbatimChar"/>
+        </w:rPr>
+        <w:t xml:space="preserve">mtry</w:t>
+      </w:r>
+      <w:r>
+        <w:t xml:space="preserve"> </w:t>
+      </w:r>
+      <w:r>
+        <w:t xml:space="preserve">goes above</w:t>
+      </w:r>
+      <w:r>
+        <w:t xml:space="preserve"> </w:t>
+      </w:r>
+      <w:r>
+        <w:rPr>
+          <w:rStyle w:val="VerbatimChar"/>
+        </w:rPr>
+        <w:t xml:space="preserve">task$n_features</w:t>
+      </w:r>
+      <w:r>
+        <w:t xml:space="preserve">. Coordinates of a spatial task and the</w:t>
+      </w:r>
+      <w:r>
+        <w:t xml:space="preserve"> </w:t>
+      </w:r>
+      <w:r>
+        <w:t xml:space="preserve">target do not count as predictors.</w:t>
+      </w:r>
+    </w:p>
+    <w:p>
+      <w:pPr>
+        <w:pStyle w:val="BodyText"/>
+      </w:pPr>
+      <w:r>
+        <w:t xml:space="preserve">Since October 2026 the server stops such a call first and tells you why:</w:t>
+      </w:r>
+    </w:p>
+    <w:p>
+      <w:pPr>
+        <w:pStyle w:val="SourceCode"/>
+      </w:pPr>
+      <w:r>
+        <w:rPr>
+          <w:rStyle w:val="VerbatimChar"/>
+        </w:rPr>
+        <w:t xml:space="preserve">BIOME-CALC: ranger mtry = 11 but the data has only 9 predictor(s).</w:t>
+      </w:r>
+    </w:p>
+    <w:p>
+      <w:pPr>
+        <w:pStyle w:val="FirstParagraph"/>
+      </w:pPr>
+      <w:r>
+        <w:rPr>
+          <w:bCs/>
+          <w:b/>
+        </w:rPr>
+        <w:t xml:space="preserve">What to do</w:t>
+      </w:r>
+    </w:p>
+    <w:p>
+      <w:pPr>
+        <w:numPr>
+          <w:ilvl w:val="0"/>
+          <w:numId w:val="1019"/>
+        </w:numPr>
+        <w:pStyle w:val="Compact"/>
+      </w:pPr>
+      <w:r>
+        <w:t xml:space="preserve">Set the upper bound from the task:</w:t>
+      </w:r>
+      <w:r>
+        <w:t xml:space="preserve"> </w:t>
+      </w:r>
+      <w:r>
+        <w:rPr>
+          <w:rStyle w:val="VerbatimChar"/>
+        </w:rPr>
+        <w:t xml:space="preserve">mtry = p_int(lower = 1L, upper = task.sp$n_features)</w:t>
+      </w:r>
+      <w:r>
+        <w:t xml:space="preserve">,</w:t>
+      </w:r>
+      <w:r>
+        <w:t xml:space="preserve"> </w:t>
+      </w:r>
+      <w:r>
+        <w:t xml:space="preserve">or tune</w:t>
+      </w:r>
+      <w:r>
+        <w:t xml:space="preserve"> </w:t>
+      </w:r>
+      <w:r>
+        <w:rPr>
+          <w:rStyle w:val="VerbatimChar"/>
+        </w:rPr>
+        <w:t xml:space="preserve">mtry.ratio = p_dbl(0.1, 1)</w:t>
+      </w:r>
+      <w:r>
+        <w:t xml:space="preserve"> </w:t>
+      </w:r>
+      <w:r>
+        <w:t xml:space="preserve">instead of</w:t>
+      </w:r>
+      <w:r>
+        <w:t xml:space="preserve"> </w:t>
+      </w:r>
+      <w:r>
+        <w:rPr>
+          <w:rStyle w:val="VerbatimChar"/>
+        </w:rPr>
+        <w:t xml:space="preserve">mtry</w:t>
+      </w:r>
+      <w:r>
+        <w:t xml:space="preserve">.</w:t>
+      </w:r>
+    </w:p>
+    <w:p>
+      <w:pPr>
+        <w:numPr>
+          <w:ilvl w:val="0"/>
+          <w:numId w:val="1019"/>
+        </w:numPr>
+        <w:pStyle w:val="Compact"/>
+      </w:pPr>
+      <w:r>
+        <w:t xml:space="preserve">To see the real message, run one learner without parallelism:</w:t>
+      </w:r>
+      <w:r>
+        <w:t xml:space="preserve"> </w:t>
+      </w:r>
+      <w:r>
+        <w:rPr>
+          <w:rStyle w:val="VerbatimChar"/>
+        </w:rPr>
+        <w:t xml:space="preserve">future::plan("sequential")</w:t>
+      </w:r>
+      <w:r>
+        <w:t xml:space="preserve">, then</w:t>
+      </w:r>
+      <w:r>
+        <w:t xml:space="preserve"> </w:t>
+      </w:r>
+      <w:r>
+        <w:rPr>
+          <w:rStyle w:val="VerbatimChar"/>
+        </w:rPr>
+        <w:t xml:space="preserve">lrn$train(task)</w:t>
+      </w:r>
+      <w:r>
+        <w:t xml:space="preserve"> </w:t>
+      </w:r>
+      <w:r>
+        <w:t xml:space="preserve">with the failing values.</w:t>
+      </w:r>
+    </w:p>
+    <w:bookmarkEnd w:id="35"/>
+    <w:bookmarkEnd w:id="36"/>
     <w:sectPr>
       <w:footerReference r:id="rId9" w:type="default"/>
       <w:pgSz w:h="16838" w:w="11906"/>
@@ -5665,7 +6322,7 @@
         <w:color w:val="666666"/>
         <w:sz w:val="16"/>
       </w:rPr>
-      <w:t xml:space="preserve">BIOME-CALC documentation · version of 2026-10-08</w:t>
+      <w:t xml:space="preserve">BIOME-CALC documentation · version of 2026-10-28</w:t>
     </w:r>
     <w:r>
       <w:rPr>
@@ -5733,7 +6390,7 @@
 <file path=word/numbering.xml><?xml version="1.0" encoding="utf-8"?>
 <w:numbering xmlns:w="http://schemas.openxmlformats.org/wordprocessingml/2006/main">
   <w:abstractNum w:abstractNumId="990">
-    <w:nsid w:val="0000A990"/>
+    <w:nsid w:val="A990"/>
     <w:multiLevelType w:val="multilevel"/>
     <w:lvl w:ilvl="0">
       <w:numFmt w:val="bullet"/>
@@ -5809,7 +6466,7 @@
     </w:lvl>
   </w:abstractNum>
   <w:abstractNum w:abstractNumId="991">
-    <w:nsid w:val="0000A991"/>
+    <w:nsid w:val="A991"/>
     <w:multiLevelType w:val="multilevel"/>
     <w:lvl w:ilvl="0">
       <w:numFmt w:val="bullet"/>
@@ -5885,7 +6542,7 @@
     </w:lvl>
   </w:abstractNum>
   <w:abstractNum w:abstractNumId="99411">
-    <w:nsid w:val="00A99411"/>
+    <w:nsid w:val="A99411"/>
     <w:multiLevelType w:val="multilevel"/>
     <w:lvl w:ilvl="0">
       <w:start w:val="1"/>
@@ -6050,6 +6707,12 @@
   <w:num w:numId="1017">
     <w:abstractNumId w:val="991"/>
   </w:num>
+  <w:num w:numId="1018">
+    <w:abstractNumId w:val="991"/>
+  </w:num>
+  <w:num w:numId="1019">
+    <w:abstractNumId w:val="991"/>
+  </w:num>
 </w:numbering>
 </file>
 
@@ -6079,10 +6742,10 @@
     <w:name w:val="Body Text"/>
     <w:basedOn w:val="Normal"/>
     <w:link w:val="BodyTextChar"/>
-    <w:qFormat/>
     <w:pPr>
       <w:spacing w:after="180" w:before="180"/>
     </w:pPr>
+    <w:qFormat/>
   </w:style>
   <w:style w:customStyle="1" w:styleId="FirstParagraph" w:type="paragraph">
     <w:name w:val="First Paragraph"/>
@@ -6161,14 +6824,15 @@
     <w:pPr>
       <w:keepNext/>
       <w:keepLines/>
+      <w:jc w:val="center"/>
       <w:spacing w:after="0" w:before="300"/>
-      <w:jc w:val="center"/>
     </w:pPr>
     <w:rPr>
+      <w:sz w:val="20"/>
+      <w:szCs w:val="20"/>
       <w:b/>
       <w:color w:val="345A8A"/>
-      <w:sz w:val="20"/>
-      <w:szCs w:val="20"/>
+      &gt;
     </w:rPr>
   </w:style>
   <w:style w:customStyle="1" w:styleId="Abstract" w:type="paragraph">
@@ -6399,18 +7063,6 @@
     <w:unhideWhenUsed/>
     <w:qFormat/>
   </w:style>
-  <w:style w:styleId="FootnoteBlockText" w:type="paragraph">
-    <w:name w:val="Footnote Block Text"/>
-    <w:basedOn w:val="Footnote Text"/>
-    <w:next w:val="Footnote Text"/>
-    <w:uiPriority w:val="9"/>
-    <w:unhideWhenUsed/>
-    <w:qFormat/>
-    <w:pPr>
-      <w:spacing w:after="100" w:before="100"/>
-      <w:ind w:firstLine="0" w:left="480" w:right="480"/>
-    </w:pPr>
-  </w:style>
   <w:style w:default="1" w:styleId="DefaultParagraphFont" w:type="character">
     <w:name w:val="Default Paragraph Font"/>
     <w:semiHidden/>
@@ -6614,8 +7266,8 @@
     <w:name w:val="KeywordTok"/>
     <w:basedOn w:val="VerbatimChar"/>
     <w:rPr>
+      <w:color w:val="007020"/>
       <w:b/>
-      <w:color w:val="007020"/>
     </w:rPr>
   </w:style>
   <w:style w:type="character" w:customStyle="1" w:styleId="DataTypeTok">
@@ -6692,42 +7344,42 @@
     <w:name w:val="ImportTok"/>
     <w:basedOn w:val="VerbatimChar"/>
     <w:rPr>
+      <w:color w:val="008000"/>
       <w:b/>
-      <w:color w:val="008000"/>
     </w:rPr>
   </w:style>
   <w:style w:type="character" w:customStyle="1" w:styleId="CommentTok">
     <w:name w:val="CommentTok"/>
     <w:basedOn w:val="VerbatimChar"/>
     <w:rPr>
+      <w:color w:val="60a0b0"/>
       <w:i/>
-      <w:color w:val="60a0b0"/>
     </w:rPr>
   </w:style>
   <w:style w:type="character" w:customStyle="1" w:styleId="DocumentationTok">
     <w:name w:val="DocumentationTok"/>
     <w:basedOn w:val="VerbatimChar"/>
     <w:rPr>
+      <w:color w:val="ba2121"/>
       <w:i/>
-      <w:color w:val="ba2121"/>
     </w:rPr>
   </w:style>
   <w:style w:type="character" w:customStyle="1" w:styleId="AnnotationTok">
     <w:name w:val="AnnotationTok"/>
     <w:basedOn w:val="VerbatimChar"/>
     <w:rPr>
+      <w:color w:val="60a0b0"/>
       <w:b/>
       <w:i/>
-      <w:color w:val="60a0b0"/>
     </w:rPr>
   </w:style>
   <w:style w:type="character" w:customStyle="1" w:styleId="CommentVarTok">
     <w:name w:val="CommentVarTok"/>
     <w:basedOn w:val="VerbatimChar"/>
     <w:rPr>
+      <w:color w:val="60a0b0"/>
       <w:b/>
       <w:i/>
-      <w:color w:val="60a0b0"/>
     </w:rPr>
   </w:style>
   <w:style w:type="character" w:customStyle="1" w:styleId="OtherTok">
@@ -6755,8 +7407,8 @@
     <w:name w:val="ControlFlowTok"/>
     <w:basedOn w:val="VerbatimChar"/>
     <w:rPr>
+      <w:color w:val="007020"/>
       <w:b/>
-      <w:color w:val="007020"/>
     </w:rPr>
   </w:style>
   <w:style w:type="character" w:customStyle="1" w:styleId="OperatorTok">
@@ -6801,34 +7453,34 @@
     <w:name w:val="InformationTok"/>
     <w:basedOn w:val="VerbatimChar"/>
     <w:rPr>
+      <w:color w:val="60a0b0"/>
       <w:b/>
       <w:i/>
-      <w:color w:val="60a0b0"/>
     </w:rPr>
   </w:style>
   <w:style w:type="character" w:customStyle="1" w:styleId="WarningTok">
     <w:name w:val="WarningTok"/>
     <w:basedOn w:val="VerbatimChar"/>
     <w:rPr>
+      <w:color w:val="60a0b0"/>
       <w:b/>
       <w:i/>
-      <w:color w:val="60a0b0"/>
     </w:rPr>
   </w:style>
   <w:style w:type="character" w:customStyle="1" w:styleId="AlertTok">
     <w:name w:val="AlertTok"/>
     <w:basedOn w:val="VerbatimChar"/>
     <w:rPr>
+      <w:color w:val="ff0000"/>
       <w:b/>
-      <w:color w:val="ff0000"/>
     </w:rPr>
   </w:style>
   <w:style w:type="character" w:customStyle="1" w:styleId="ErrorTok">
     <w:name w:val="ErrorTok"/>
     <w:basedOn w:val="VerbatimChar"/>
     <w:rPr>
+      <w:color w:val="ff0000"/>
       <w:b/>
-      <w:color w:val="ff0000"/>
     </w:rPr>
   </w:style>
   <w:style w:type="character" w:customStyle="1" w:styleId="NormalTok">

</xml_diff>